<commit_message>
update ktra trc hoàn form
</commit_message>
<xml_diff>
--- a/static/media/3.kh_giam_sat_hoan_gtgt.docx
+++ b/static/media/3.kh_giam_sat_hoan_gtgt.docx
@@ -1,11 +1,11 @@
 
 <file path=word/document.xml><?xml version="1.0" encoding="utf-8"?>
-<w:document xmlns:wpc="http://schemas.microsoft.com/office/word/2010/wordprocessingCanvas" xmlns:cx="http://schemas.microsoft.com/office/drawing/2014/chartex" xmlns:cx1="http://schemas.microsoft.com/office/drawing/2015/9/8/chartex" xmlns:cx2="http://schemas.microsoft.com/office/drawing/2015/10/21/chartex" xmlns:cx3="http://schemas.microsoft.com/office/drawing/2016/5/9/chartex" xmlns:cx4="http://schemas.microsoft.com/office/drawing/2016/5/10/chartex" xmlns:cx5="http://schemas.microsoft.com/office/drawing/2016/5/11/chartex" xmlns:cx6="http://schemas.microsoft.com/office/drawing/2016/5/12/chartex" xmlns:cx7="http://schemas.microsoft.com/office/drawing/2016/5/13/chartex" xmlns:cx8="http://schemas.microsoft.com/office/drawing/2016/5/14/chartex" xmlns:mc="http://schemas.openxmlformats.org/markup-compatibility/2006" xmlns:aink="http://schemas.microsoft.com/office/drawing/2016/ink" xmlns:am3d="http://schemas.microsoft.com/office/drawing/2017/model3d" xmlns:o="urn:schemas-microsoft-com:office:office" xmlns:r="http://schemas.openxmlformats.org/officeDocument/2006/relationships" xmlns:m="http://schemas.openxmlformats.org/officeDocument/2006/math" xmlns:v="urn:schemas-microsoft-com:vml" xmlns:wp14="http://schemas.microsoft.com/office/word/2010/wordprocessingDrawing" xmlns:wp="http://schemas.openxmlformats.org/drawingml/2006/wordprocessingDrawing" xmlns:w10="urn:schemas-microsoft-com:office:word" xmlns:w="http://schemas.openxmlformats.org/wordprocessingml/2006/main" xmlns:w14="http://schemas.microsoft.com/office/word/2010/wordml" xmlns:w15="http://schemas.microsoft.com/office/word/2012/wordml" xmlns:w16cex="http://schemas.microsoft.com/office/word/2018/wordml/cex" xmlns:w16cid="http://schemas.microsoft.com/office/word/2016/wordml/cid" xmlns:w16="http://schemas.microsoft.com/office/word/2018/wordml" xmlns:w16sdtdh="http://schemas.microsoft.com/office/word/2020/wordml/sdtdatahash" xmlns:w16se="http://schemas.microsoft.com/office/word/2015/wordml/symex" xmlns:wpg="http://schemas.microsoft.com/office/word/2010/wordprocessingGroup" xmlns:wpi="http://schemas.microsoft.com/office/word/2010/wordprocessingInk" xmlns:wne="http://schemas.microsoft.com/office/word/2006/wordml" xmlns:wps="http://schemas.microsoft.com/office/word/2010/wordprocessingShape" mc:Ignorable="w14 w15 w16se w16cid w16 w16cex w16sdtdh wp14">
+<w:document xmlns:wpc="http://schemas.microsoft.com/office/word/2010/wordprocessingCanvas" xmlns:cx="http://schemas.microsoft.com/office/drawing/2014/chartex" xmlns:cx1="http://schemas.microsoft.com/office/drawing/2015/9/8/chartex" xmlns:cx2="http://schemas.microsoft.com/office/drawing/2015/10/21/chartex" xmlns:cx3="http://schemas.microsoft.com/office/drawing/2016/5/9/chartex" xmlns:cx4="http://schemas.microsoft.com/office/drawing/2016/5/10/chartex" xmlns:cx5="http://schemas.microsoft.com/office/drawing/2016/5/11/chartex" xmlns:cx6="http://schemas.microsoft.com/office/drawing/2016/5/12/chartex" xmlns:cx7="http://schemas.microsoft.com/office/drawing/2016/5/13/chartex" xmlns:cx8="http://schemas.microsoft.com/office/drawing/2016/5/14/chartex" xmlns:mc="http://schemas.openxmlformats.org/markup-compatibility/2006" xmlns:aink="http://schemas.microsoft.com/office/drawing/2016/ink" xmlns:am3d="http://schemas.microsoft.com/office/drawing/2017/model3d" xmlns:o="urn:schemas-microsoft-com:office:office" xmlns:oel="http://schemas.microsoft.com/office/2019/extlst" xmlns:r="http://schemas.openxmlformats.org/officeDocument/2006/relationships" xmlns:m="http://schemas.openxmlformats.org/officeDocument/2006/math" xmlns:v="urn:schemas-microsoft-com:vml" xmlns:wp14="http://schemas.microsoft.com/office/word/2010/wordprocessingDrawing" xmlns:wp="http://schemas.openxmlformats.org/drawingml/2006/wordprocessingDrawing" xmlns:w10="urn:schemas-microsoft-com:office:word" xmlns:w="http://schemas.openxmlformats.org/wordprocessingml/2006/main" xmlns:w14="http://schemas.microsoft.com/office/word/2010/wordml" xmlns:w15="http://schemas.microsoft.com/office/word/2012/wordml" xmlns:w16cex="http://schemas.microsoft.com/office/word/2018/wordml/cex" xmlns:w16cid="http://schemas.microsoft.com/office/word/2016/wordml/cid" xmlns:w16="http://schemas.microsoft.com/office/word/2018/wordml" xmlns:w16du="http://schemas.microsoft.com/office/word/2023/wordml/word16du" xmlns:w16sdtdh="http://schemas.microsoft.com/office/word/2020/wordml/sdtdatahash" xmlns:w16sdtfl="http://schemas.microsoft.com/office/word/2024/wordml/sdtformatlock" xmlns:w16se="http://schemas.microsoft.com/office/word/2015/wordml/symex" xmlns:wpg="http://schemas.microsoft.com/office/word/2010/wordprocessingGroup" xmlns:wpi="http://schemas.microsoft.com/office/word/2010/wordprocessingInk" xmlns:wne="http://schemas.microsoft.com/office/word/2006/wordml" xmlns:wps="http://schemas.microsoft.com/office/word/2010/wordprocessingShape" mc:Ignorable="w14 w15 w16se w16cid w16 w16cex w16sdtdh w16sdtfl w16du wp14">
   <w:body>
     <w:p>
       <w:pPr>
         <w:tabs>
-          <w:tab w:val="center" w:pos="1276"/>
+          <w:tab w:val="center" w:pos="1701"/>
           <w:tab w:val="center" w:pos="6804"/>
         </w:tabs>
         <w:ind w:left="-567" w:right="-234"/>
@@ -28,7 +28,7 @@
           <w:sz w:val="24"/>
           <w:szCs w:val="24"/>
         </w:rPr>
-        <w:t>TỔNG CỤC THUẾ</w:t>
+        <w:t>CỤC THUẾ</w:t>
       </w:r>
       <w:r>
         <w:rPr>
@@ -62,7 +62,7 @@
     <w:p>
       <w:pPr>
         <w:tabs>
-          <w:tab w:val="center" w:pos="1276"/>
+          <w:tab w:val="center" w:pos="1701"/>
           <w:tab w:val="center" w:pos="6804"/>
         </w:tabs>
         <w:ind w:left="-567"/>
@@ -157,19 +157,25 @@
         <w:rPr>
           <w:b/>
         </w:rPr>
+        <w:t xml:space="preserve">CHI </w:t>
+      </w:r>
+      <w:r>
+        <w:rPr>
+          <w:b/>
+        </w:rPr>
         <w:t>CỤC THUẾ</w:t>
       </w:r>
       <w:r>
         <w:rPr>
           <w:b/>
         </w:rPr>
-        <w:t xml:space="preserve"> TỈNH</w:t>
-      </w:r>
-      <w:r>
-        <w:rPr>
-          <w:b/>
-        </w:rPr>
-        <w:t xml:space="preserve"> QUẢNG TRỊ</w:t>
+        <w:t xml:space="preserve"> </w:t>
+      </w:r>
+      <w:r>
+        <w:rPr>
+          <w:b/>
+        </w:rPr>
+        <w:t>KHU VỰC XI</w:t>
       </w:r>
       <w:r>
         <w:rPr>
@@ -221,16 +227,16 @@
         <mc:AlternateContent>
           <mc:Choice Requires="wps">
             <w:drawing>
-              <wp:anchor distT="0" distB="0" distL="114300" distR="114300" simplePos="0" relativeHeight="251656704" behindDoc="0" locked="0" layoutInCell="1" allowOverlap="1" wp14:anchorId="51AEFD23" wp14:editId="41320C1E">
+              <wp:anchor distT="0" distB="0" distL="114300" distR="114300" simplePos="0" relativeHeight="251656704" behindDoc="0" locked="0" layoutInCell="1" allowOverlap="1" wp14:anchorId="51AEFD23" wp14:editId="5CF321B8">
                 <wp:simplePos x="0" y="0"/>
                 <wp:positionH relativeFrom="column">
-                  <wp:posOffset>388620</wp:posOffset>
+                  <wp:posOffset>655320</wp:posOffset>
                 </wp:positionH>
                 <wp:positionV relativeFrom="paragraph">
                   <wp:posOffset>5715</wp:posOffset>
                 </wp:positionV>
                 <wp:extent cx="800100" cy="0"/>
-                <wp:effectExtent l="0" t="0" r="19050" b="19050"/>
+                <wp:effectExtent l="0" t="0" r="0" b="0"/>
                 <wp:wrapNone/>
                 <wp:docPr id="3" name="Line 12"/>
                 <wp:cNvGraphicFramePr>
@@ -282,7 +288,7 @@
           </mc:Choice>
           <mc:Fallback>
             <w:pict>
-              <v:line w14:anchorId="39896AE6" id="Line 12" o:spid="_x0000_s1026" style="position:absolute;z-index:251656704;visibility:visible;mso-wrap-style:square;mso-width-percent:0;mso-height-percent:0;mso-wrap-distance-left:9pt;mso-wrap-distance-top:0;mso-wrap-distance-right:9pt;mso-wrap-distance-bottom:0;mso-position-horizontal:absolute;mso-position-horizontal-relative:text;mso-position-vertical:absolute;mso-position-vertical-relative:text;mso-width-percent:0;mso-height-percent:0;mso-width-relative:page;mso-height-relative:page" from="30.6pt,.45pt" to="93.6pt,.45pt" o:gfxdata="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"/>
+              <v:line w14:anchorId="291D5F9B" id="Line 12" o:spid="_x0000_s1026" style="position:absolute;z-index:251656704;visibility:visible;mso-wrap-style:square;mso-width-percent:0;mso-height-percent:0;mso-wrap-distance-left:9pt;mso-wrap-distance-top:0;mso-wrap-distance-right:9pt;mso-wrap-distance-bottom:0;mso-position-horizontal:absolute;mso-position-horizontal-relative:text;mso-position-vertical:absolute;mso-position-vertical-relative:text;mso-width-percent:0;mso-height-percent:0;mso-width-relative:page;mso-height-relative:page" from="51.6pt,.45pt" to="114.6pt,.45pt" o:gfxdata="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"/>
             </w:pict>
           </mc:Fallback>
         </mc:AlternateContent>
@@ -576,7 +582,21 @@
           <w:sz w:val="28"/>
           <w:szCs w:val="28"/>
         </w:rPr>
-        <w:t xml:space="preserve"> của Cục trưởng Cục Thuế tỉnh Quảng Trị về việc giám sát hoạt động của Đoàn ki</w:t>
+        <w:t xml:space="preserve"> của </w:t>
+      </w:r>
+      <w:r>
+        <w:rPr>
+          <w:sz w:val="28"/>
+          <w:szCs w:val="28"/>
+        </w:rPr>
+        <w:t>Chi cục Thuế khu vực XI</w:t>
+      </w:r>
+      <w:r>
+        <w:rPr>
+          <w:sz w:val="28"/>
+          <w:szCs w:val="28"/>
+        </w:rPr>
+        <w:t xml:space="preserve"> về việc giám sát hoạt động của Đoàn ki</w:t>
       </w:r>
       <w:r>
         <w:rPr>
@@ -681,112 +701,7 @@
           <w:sz w:val="28"/>
           <w:szCs w:val="28"/>
         </w:rPr>
-        <w:t xml:space="preserve">- Mục đích: </w:t>
-      </w:r>
-      <w:r>
-        <w:rPr>
-          <w:sz w:val="28"/>
-          <w:szCs w:val="28"/>
-        </w:rPr>
-        <w:t xml:space="preserve">Giám sát hoạt động của </w:t>
-      </w:r>
-      <w:r>
-        <w:rPr>
-          <w:sz w:val="28"/>
-          <w:szCs w:val="28"/>
-        </w:rPr>
-        <w:t>Đoàn kiểm tra trước hoàn thuế GTGT</w:t>
-      </w:r>
-      <w:r>
-        <w:rPr>
-          <w:sz w:val="28"/>
-          <w:szCs w:val="28"/>
-        </w:rPr>
-        <w:t xml:space="preserve"> </w:t>
-      </w:r>
-      <w:r>
-        <w:rPr>
-          <w:sz w:val="28"/>
-          <w:szCs w:val="28"/>
-        </w:rPr>
-        <w:t xml:space="preserve">nhằm theo dõi, nắm bắt việc chấp hành pháp luật, tuân thủ Luật quản lý thuế, Quy trình </w:t>
-      </w:r>
-      <w:r>
-        <w:rPr>
-          <w:sz w:val="28"/>
-          <w:szCs w:val="28"/>
-        </w:rPr>
-        <w:t xml:space="preserve">kiểm </w:t>
-      </w:r>
-      <w:r>
-        <w:rPr>
-          <w:sz w:val="28"/>
-          <w:szCs w:val="28"/>
-        </w:rPr>
-        <w:t>tra thuế</w:t>
-      </w:r>
-      <w:r>
-        <w:rPr>
-          <w:sz w:val="28"/>
-          <w:szCs w:val="28"/>
-        </w:rPr>
-        <w:t xml:space="preserve">, tuân thủ chuẩn mực đạo đức, quy tắc ứng xử của công chức thuế và ý thức kỷ luật của Trưởng đoàn, thành viên </w:t>
-      </w:r>
-      <w:r>
-        <w:rPr>
-          <w:sz w:val="28"/>
-          <w:szCs w:val="28"/>
-        </w:rPr>
-        <w:t>Đoàn kiểm tra trước hoàn thuế GTGT</w:t>
-      </w:r>
-      <w:r>
-        <w:rPr>
-          <w:sz w:val="28"/>
-          <w:szCs w:val="28"/>
-        </w:rPr>
-        <w:t xml:space="preserve">; tình hình thực hiện nhiệm vụ và triển khai hoạt động </w:t>
-      </w:r>
-      <w:r>
-        <w:rPr>
-          <w:sz w:val="28"/>
-          <w:szCs w:val="28"/>
-        </w:rPr>
-        <w:t xml:space="preserve">kiểm </w:t>
-      </w:r>
-      <w:r>
-        <w:rPr>
-          <w:sz w:val="28"/>
-          <w:szCs w:val="28"/>
-        </w:rPr>
-        <w:t>tra thuế</w:t>
-      </w:r>
-      <w:r>
-        <w:rPr>
-          <w:sz w:val="28"/>
-          <w:szCs w:val="28"/>
-        </w:rPr>
-        <w:t xml:space="preserve"> để kịp thời có biện pháp chấn chỉnh, xử lý nhằm đảm bảo thực hiện đúng mục đích, yêu cầu, nội dung theo kế hoạch </w:t>
-      </w:r>
-      <w:r>
-        <w:rPr>
-          <w:sz w:val="28"/>
-          <w:szCs w:val="28"/>
-        </w:rPr>
-        <w:t>kiểm tra</w:t>
-      </w:r>
-      <w:r>
-        <w:rPr>
-          <w:sz w:val="28"/>
-          <w:szCs w:val="28"/>
-        </w:rPr>
-        <w:t xml:space="preserve"> </w:t>
-      </w:r>
-      <w:r>
-        <w:rPr>
-          <w:sz w:val="28"/>
-          <w:szCs w:val="28"/>
-        </w:rPr>
-        <w:t>đã được phê duyệt.</w:t>
+        <w:t>- Mục đích: Giám sát hoạt động của đoàn kiểm tra nhằm theo dõi, nắm bắt việc chấp hành pháp luật, tuân thủ Luật quản lý thuế, Quy trình kiểm tra thuế, tuân thủ chuẩn mực đạo đức, quy tắc ứng xử của công chức thuế và ý thức kỷ luật của trưởng đoàn, thành viên đoàn kiểm tra thuế; tình hình thực hiện nhiệm vụ và triển khai hoạt động kiểm tra thuế để kịp thời có biện pháp chấn chỉnh, xử lý nhằm đảm bảo thực hiện đúng mục đích, yêu cầu, nội dung theo kế hoạch kiểm tra đã được phê duyệt.</w:t>
       </w:r>
     </w:p>
     <w:p>
@@ -804,34 +719,13 @@
           <w:sz w:val="28"/>
           <w:szCs w:val="28"/>
         </w:rPr>
-        <w:t xml:space="preserve">- Yêu cầu: </w:t>
-      </w:r>
-      <w:r>
-        <w:rPr>
-          <w:sz w:val="28"/>
-          <w:szCs w:val="28"/>
-        </w:rPr>
-        <w:t xml:space="preserve">việc giám sát phải được thực hiện thường xuyên, liên tục trong quá trình hoạt động của </w:t>
-      </w:r>
-      <w:r>
-        <w:rPr>
-          <w:sz w:val="28"/>
-          <w:szCs w:val="28"/>
-        </w:rPr>
-        <w:t>Đoàn kiểm tra trước hoàn thuế GTGT</w:t>
-      </w:r>
-      <w:r>
-        <w:rPr>
-          <w:sz w:val="28"/>
-          <w:szCs w:val="28"/>
-        </w:rPr>
-        <w:t xml:space="preserve"> tại trụ sở NNT và đảm bảo tính khách quan, kịp thời, đầy đủ, chính xác.</w:t>
+        <w:t>- Yêu cầu: việc giám sát phải được thực hiện thường xuyên, liên tục trong quá trình hoạt động của đoàn kiểm tra thuế tại trụ sở NNT và đảm bảo tính khách quan, kịp thời, đầy đủ, chính xác.</w:t>
       </w:r>
     </w:p>
     <w:p>
       <w:pPr>
         <w:spacing w:line="264" w:lineRule="auto"/>
-        <w:ind w:firstLine="720"/>
+        <w:ind w:firstLine="567"/>
         <w:jc w:val="both"/>
         <w:rPr>
           <w:b/>
@@ -864,98 +758,7 @@
           <w:sz w:val="28"/>
           <w:szCs w:val="28"/>
         </w:rPr>
-        <w:t xml:space="preserve">Thực hiện theo quy định tại Điều 8 của quy chế giám sát hoạt động của đoàn </w:t>
-      </w:r>
-      <w:r>
-        <w:rPr>
-          <w:sz w:val="28"/>
-          <w:szCs w:val="28"/>
-        </w:rPr>
-        <w:t>ki</w:t>
-      </w:r>
-      <w:r>
-        <w:rPr>
-          <w:sz w:val="28"/>
-          <w:szCs w:val="28"/>
-        </w:rPr>
-        <w:t>ể</w:t>
-      </w:r>
-      <w:r>
-        <w:rPr>
-          <w:sz w:val="28"/>
-          <w:szCs w:val="28"/>
-        </w:rPr>
-        <w:t>m</w:t>
-      </w:r>
-      <w:r>
-        <w:rPr>
-          <w:sz w:val="28"/>
-          <w:szCs w:val="28"/>
-        </w:rPr>
-        <w:t xml:space="preserve"> tra</w:t>
-      </w:r>
-      <w:r>
-        <w:rPr>
-          <w:sz w:val="28"/>
-          <w:szCs w:val="28"/>
-        </w:rPr>
-        <w:t xml:space="preserve"> trư</w:t>
-      </w:r>
-      <w:r>
-        <w:rPr>
-          <w:sz w:val="28"/>
-          <w:szCs w:val="28"/>
-        </w:rPr>
-        <w:t>ớ</w:t>
-      </w:r>
-      <w:r>
-        <w:rPr>
-          <w:sz w:val="28"/>
-          <w:szCs w:val="28"/>
-        </w:rPr>
-        <w:t>c ho</w:t>
-      </w:r>
-      <w:r>
-        <w:rPr>
-          <w:sz w:val="28"/>
-          <w:szCs w:val="28"/>
-        </w:rPr>
-        <w:t>àn</w:t>
-      </w:r>
-      <w:r>
-        <w:rPr>
-          <w:sz w:val="28"/>
-          <w:szCs w:val="28"/>
-        </w:rPr>
-        <w:t xml:space="preserve"> thuế (kèm theo Quyết định số </w:t>
-      </w:r>
-      <w:r>
-        <w:rPr>
-          <w:sz w:val="28"/>
-          <w:szCs w:val="28"/>
-        </w:rPr>
-        <w:t>1614</w:t>
-      </w:r>
-      <w:r>
-        <w:rPr>
-          <w:sz w:val="28"/>
-          <w:szCs w:val="28"/>
-        </w:rPr>
-        <w:t xml:space="preserve">/QĐ-TCT ngày </w:t>
-      </w:r>
-      <w:r>
-        <w:rPr>
-          <w:sz w:val="28"/>
-          <w:szCs w:val="28"/>
-        </w:rPr>
-        <w:t>13/10/2020</w:t>
-      </w:r>
-      <w:r>
-        <w:rPr>
-          <w:sz w:val="28"/>
-          <w:szCs w:val="28"/>
-        </w:rPr>
-        <w:t xml:space="preserve"> của Tổng cục trưởng Tổng cục Thuế), cụ thể:</w:t>
+        <w:t>Thực hiện theo quy định tại Điều 8 của quy chế giám sát hoạt động của đoàn kiểm tra (kèm theo Quyết định số 1614/QĐ-TCT ngày 13/10/2020 của Tổng cục Thuế), cụ thể:</w:t>
       </w:r>
     </w:p>
     <w:p>
@@ -974,49 +777,7 @@
           <w:sz w:val="28"/>
           <w:szCs w:val="28"/>
         </w:rPr>
-        <w:t xml:space="preserve">1. Giám sát việc chấp hành pháp luật của Trưởng đoàn </w:t>
-      </w:r>
-      <w:r>
-        <w:rPr>
-          <w:sz w:val="28"/>
-          <w:szCs w:val="28"/>
-        </w:rPr>
-        <w:t>thanh</w:t>
-      </w:r>
-      <w:r>
-        <w:rPr>
-          <w:sz w:val="28"/>
-          <w:szCs w:val="28"/>
-        </w:rPr>
-        <w:t xml:space="preserve"> tra, thành viên Đoàn </w:t>
-      </w:r>
-      <w:r>
-        <w:rPr>
-          <w:sz w:val="28"/>
-          <w:szCs w:val="28"/>
-        </w:rPr>
-        <w:t>ki</w:t>
-      </w:r>
-      <w:r>
-        <w:rPr>
-          <w:sz w:val="28"/>
-          <w:szCs w:val="28"/>
-        </w:rPr>
-        <w:t>ể</w:t>
-      </w:r>
-      <w:r>
-        <w:rPr>
-          <w:sz w:val="28"/>
-          <w:szCs w:val="28"/>
-        </w:rPr>
-        <w:t>m</w:t>
-      </w:r>
-      <w:r>
-        <w:rPr>
-          <w:sz w:val="28"/>
-          <w:szCs w:val="28"/>
-        </w:rPr>
-        <w:t xml:space="preserve"> tra bao gồm các nội dung sau:</w:t>
+        <w:t>1. Giám sát việc chấp hành pháp luật của trưởng đoàn, thành viên đoàn kiểm tra bao gồm các nội dung sau:</w:t>
       </w:r>
     </w:p>
     <w:p>
@@ -1035,161 +796,7 @@
           <w:sz w:val="28"/>
           <w:szCs w:val="28"/>
         </w:rPr>
-        <w:t>-</w:t>
-      </w:r>
-      <w:r>
-        <w:rPr>
-          <w:sz w:val="28"/>
-          <w:szCs w:val="28"/>
-        </w:rPr>
-        <w:t xml:space="preserve"> Việc thực hiện các quy định của pháp luật về trình tự, thủ tục, thời hạn tiến hành một cuộc </w:t>
-      </w:r>
-      <w:r>
-        <w:rPr>
-          <w:sz w:val="28"/>
-          <w:szCs w:val="28"/>
-        </w:rPr>
-        <w:t>thanh tra, ki</w:t>
-      </w:r>
-      <w:r>
-        <w:rPr>
-          <w:sz w:val="28"/>
-          <w:szCs w:val="28"/>
-        </w:rPr>
-        <w:t>ể</w:t>
-      </w:r>
-      <w:r>
-        <w:rPr>
-          <w:sz w:val="28"/>
-          <w:szCs w:val="28"/>
-        </w:rPr>
-        <w:t>m</w:t>
-      </w:r>
-      <w:r>
-        <w:rPr>
-          <w:sz w:val="28"/>
-          <w:szCs w:val="28"/>
-        </w:rPr>
-        <w:t xml:space="preserve"> tra</w:t>
-      </w:r>
-      <w:r>
-        <w:rPr>
-          <w:sz w:val="28"/>
-          <w:szCs w:val="28"/>
-        </w:rPr>
-        <w:t xml:space="preserve"> </w:t>
-      </w:r>
-      <w:r>
-        <w:rPr>
-          <w:sz w:val="28"/>
-          <w:szCs w:val="28"/>
-        </w:rPr>
-        <w:t>thu</w:t>
-      </w:r>
-      <w:r>
-        <w:rPr>
-          <w:sz w:val="28"/>
-          <w:szCs w:val="28"/>
-        </w:rPr>
-        <w:t>ế</w:t>
-      </w:r>
-      <w:r>
-        <w:rPr>
-          <w:sz w:val="28"/>
-          <w:szCs w:val="28"/>
-        </w:rPr>
-        <w:t xml:space="preserve"> theo quy </w:t>
-      </w:r>
-      <w:r>
-        <w:rPr>
-          <w:sz w:val="28"/>
-          <w:szCs w:val="28"/>
-        </w:rPr>
-        <w:t>địn</w:t>
-      </w:r>
-      <w:r>
-        <w:rPr>
-          <w:sz w:val="28"/>
-          <w:szCs w:val="28"/>
-        </w:rPr>
-        <w:t>h thanh tra, ki</w:t>
-      </w:r>
-      <w:r>
-        <w:rPr>
-          <w:sz w:val="28"/>
-          <w:szCs w:val="28"/>
-        </w:rPr>
-        <w:t>ểm</w:t>
-      </w:r>
-      <w:r>
-        <w:rPr>
-          <w:sz w:val="28"/>
-          <w:szCs w:val="28"/>
-        </w:rPr>
-        <w:t xml:space="preserve"> tra thu</w:t>
-      </w:r>
-      <w:r>
-        <w:rPr>
-          <w:sz w:val="28"/>
-          <w:szCs w:val="28"/>
-        </w:rPr>
-        <w:t>ế</w:t>
-      </w:r>
-      <w:r>
-        <w:rPr>
-          <w:sz w:val="28"/>
-          <w:szCs w:val="28"/>
-        </w:rPr>
-        <w:t xml:space="preserve"> bao gồm: việc thu thập, tổng hợp, đánh giá thông tin; thực hiện chế độ thông tin, báo cáo; ghi nhật ký Đoàn </w:t>
-      </w:r>
-      <w:r>
-        <w:rPr>
-          <w:sz w:val="28"/>
-          <w:szCs w:val="28"/>
-        </w:rPr>
-        <w:t>thanh tra, ki</w:t>
-      </w:r>
-      <w:r>
-        <w:rPr>
-          <w:sz w:val="28"/>
-          <w:szCs w:val="28"/>
-        </w:rPr>
-        <w:t>ể</w:t>
-      </w:r>
-      <w:r>
-        <w:rPr>
-          <w:sz w:val="28"/>
-          <w:szCs w:val="28"/>
-        </w:rPr>
-        <w:t>m</w:t>
-      </w:r>
-      <w:r>
-        <w:rPr>
-          <w:sz w:val="28"/>
-          <w:szCs w:val="28"/>
-        </w:rPr>
-        <w:t xml:space="preserve"> tra</w:t>
-      </w:r>
-      <w:r>
-        <w:rPr>
-          <w:sz w:val="28"/>
-          <w:szCs w:val="28"/>
-        </w:rPr>
-        <w:t xml:space="preserve"> thu</w:t>
-      </w:r>
-      <w:r>
-        <w:rPr>
-          <w:sz w:val="28"/>
-          <w:szCs w:val="28"/>
-        </w:rPr>
-        <w:t>ế</w:t>
-      </w:r>
-      <w:r>
-        <w:rPr>
-          <w:sz w:val="28"/>
-          <w:szCs w:val="28"/>
-        </w:rPr>
-        <w:t>;</w:t>
+        <w:t>- Việc thực hiện các quy định của pháp luật về trình tự, thủ tục, thời hạn tiến hành một cuộc thanh tra, kiểm tra thuế theo quy định thanh tra, kiểm tra thuế bao gồm: việc thu thập, tổng hợp, đánh giá thông tin; thực hiện chế độ thông tin, báo cáo; ghi nhật ký đoàn thanh tra, kiểm tra thuế;</w:t>
       </w:r>
     </w:p>
     <w:p>
@@ -1208,203 +815,7 @@
           <w:sz w:val="28"/>
           <w:szCs w:val="28"/>
         </w:rPr>
-        <w:t>-</w:t>
-      </w:r>
-      <w:r>
-        <w:rPr>
-          <w:sz w:val="28"/>
-          <w:szCs w:val="28"/>
-        </w:rPr>
-        <w:t xml:space="preserve"> Việc thực hiện các quyền trong hoạt động </w:t>
-      </w:r>
-      <w:r>
-        <w:rPr>
-          <w:sz w:val="28"/>
-          <w:szCs w:val="28"/>
-        </w:rPr>
-        <w:t>thanh tra, ki</w:t>
-      </w:r>
-      <w:r>
-        <w:rPr>
-          <w:sz w:val="28"/>
-          <w:szCs w:val="28"/>
-        </w:rPr>
-        <w:t>ể</w:t>
-      </w:r>
-      <w:r>
-        <w:rPr>
-          <w:sz w:val="28"/>
-          <w:szCs w:val="28"/>
-        </w:rPr>
-        <w:t>m</w:t>
-      </w:r>
-      <w:r>
-        <w:rPr>
-          <w:sz w:val="28"/>
-          <w:szCs w:val="28"/>
-        </w:rPr>
-        <w:t xml:space="preserve"> tra</w:t>
-      </w:r>
-      <w:r>
-        <w:rPr>
-          <w:sz w:val="28"/>
-          <w:szCs w:val="28"/>
-        </w:rPr>
-        <w:t xml:space="preserve"> thu</w:t>
-      </w:r>
-      <w:r>
-        <w:rPr>
-          <w:sz w:val="28"/>
-          <w:szCs w:val="28"/>
-        </w:rPr>
-        <w:t>ế</w:t>
-      </w:r>
-      <w:r>
-        <w:rPr>
-          <w:sz w:val="28"/>
-          <w:szCs w:val="28"/>
-        </w:rPr>
-        <w:t xml:space="preserve"> đ</w:t>
-      </w:r>
-      <w:r>
-        <w:rPr>
-          <w:sz w:val="28"/>
-          <w:szCs w:val="28"/>
-        </w:rPr>
-        <w:t>ối</w:t>
-      </w:r>
-      <w:r>
-        <w:rPr>
-          <w:sz w:val="28"/>
-          <w:szCs w:val="28"/>
-        </w:rPr>
-        <w:t xml:space="preserve"> v</w:t>
-      </w:r>
-      <w:r>
-        <w:rPr>
-          <w:sz w:val="28"/>
-          <w:szCs w:val="28"/>
-        </w:rPr>
-        <w:t>ới</w:t>
-      </w:r>
-      <w:r>
-        <w:rPr>
-          <w:sz w:val="28"/>
-          <w:szCs w:val="28"/>
-        </w:rPr>
-        <w:t xml:space="preserve"> ngư</w:t>
-      </w:r>
-      <w:r>
-        <w:rPr>
-          <w:sz w:val="28"/>
-          <w:szCs w:val="28"/>
-        </w:rPr>
-        <w:t>ời</w:t>
-      </w:r>
-      <w:r>
-        <w:rPr>
-          <w:sz w:val="28"/>
-          <w:szCs w:val="28"/>
-        </w:rPr>
-        <w:t xml:space="preserve"> đư</w:t>
-      </w:r>
-      <w:r>
-        <w:rPr>
-          <w:sz w:val="28"/>
-          <w:szCs w:val="28"/>
-        </w:rPr>
-        <w:t>ợc</w:t>
-      </w:r>
-      <w:r>
-        <w:rPr>
-          <w:sz w:val="28"/>
-          <w:szCs w:val="28"/>
-        </w:rPr>
-        <w:t xml:space="preserve"> gi</w:t>
-      </w:r>
-      <w:r>
-        <w:rPr>
-          <w:sz w:val="28"/>
-          <w:szCs w:val="28"/>
-        </w:rPr>
-        <w:t>ám</w:t>
-      </w:r>
-      <w:r>
-        <w:rPr>
-          <w:sz w:val="28"/>
-          <w:szCs w:val="28"/>
-        </w:rPr>
-        <w:t xml:space="preserve"> s</w:t>
-      </w:r>
-      <w:r>
-        <w:rPr>
-          <w:sz w:val="28"/>
-          <w:szCs w:val="28"/>
-        </w:rPr>
-        <w:t>át</w:t>
-      </w:r>
-      <w:r>
-        <w:rPr>
-          <w:sz w:val="28"/>
-          <w:szCs w:val="28"/>
-        </w:rPr>
-        <w:t xml:space="preserve">, bao gồm: căn cứ, thẩm quyền, trình tự, thủ tục và kết quả thực hiện; việc xử lý ý kiến của đối tượng </w:t>
-      </w:r>
-      <w:r>
-        <w:rPr>
-          <w:sz w:val="28"/>
-          <w:szCs w:val="28"/>
-        </w:rPr>
-        <w:t>thanh tra, ki</w:t>
-      </w:r>
-      <w:r>
-        <w:rPr>
-          <w:sz w:val="28"/>
-          <w:szCs w:val="28"/>
-        </w:rPr>
-        <w:t>ể</w:t>
-      </w:r>
-      <w:r>
-        <w:rPr>
-          <w:sz w:val="28"/>
-          <w:szCs w:val="28"/>
-        </w:rPr>
-        <w:t>m</w:t>
-      </w:r>
-      <w:r>
-        <w:rPr>
-          <w:sz w:val="28"/>
-          <w:szCs w:val="28"/>
-        </w:rPr>
-        <w:t xml:space="preserve"> tra và các cơ quan, tổ chức, cá nhân có liên quan đến việc thực hiện các quyền trong hoạt động thanh tra</w:t>
-      </w:r>
-      <w:r>
-        <w:rPr>
-          <w:sz w:val="28"/>
-          <w:szCs w:val="28"/>
-        </w:rPr>
-        <w:t>,ki</w:t>
-      </w:r>
-      <w:r>
-        <w:rPr>
-          <w:sz w:val="28"/>
-          <w:szCs w:val="28"/>
-        </w:rPr>
-        <w:t>ểm</w:t>
-      </w:r>
-      <w:r>
-        <w:rPr>
-          <w:sz w:val="28"/>
-          <w:szCs w:val="28"/>
-        </w:rPr>
-        <w:t xml:space="preserve"> tra</w:t>
-      </w:r>
-      <w:r>
-        <w:rPr>
-          <w:sz w:val="28"/>
-          <w:szCs w:val="28"/>
-        </w:rPr>
-        <w:t>;</w:t>
+        <w:t>- Việc thực hiện các quyền trong hoạt động thanh tra, kiểm tra thuế đối với người được giám sát, bao gồm: căn cứ, thẩm quyền, trình tự, thủ tục và kết quả thực hiện; việc xử lý ý kiến của đối tượng thanh tra, kiểm tra và các cơ quan, tổ chức, cá nhân có liên quan đến việc thực hiện các quyền trong hoạt động thanh tra, kiểm tra;</w:t>
       </w:r>
     </w:p>
     <w:p>
@@ -1423,126 +834,7 @@
           <w:sz w:val="28"/>
           <w:szCs w:val="28"/>
         </w:rPr>
-        <w:t>-</w:t>
-      </w:r>
-      <w:r>
-        <w:rPr>
-          <w:sz w:val="28"/>
-          <w:szCs w:val="28"/>
-        </w:rPr>
-        <w:t xml:space="preserve"> Việc thực hiện các quy định của pháp luật đối với Trưởng đoàn thanh tra</w:t>
-      </w:r>
-      <w:r>
-        <w:rPr>
-          <w:sz w:val="28"/>
-          <w:szCs w:val="28"/>
-        </w:rPr>
-        <w:t>, ki</w:t>
-      </w:r>
-      <w:r>
-        <w:rPr>
-          <w:sz w:val="28"/>
-          <w:szCs w:val="28"/>
-        </w:rPr>
-        <w:t>ểm</w:t>
-      </w:r>
-      <w:r>
-        <w:rPr>
-          <w:sz w:val="28"/>
-          <w:szCs w:val="28"/>
-        </w:rPr>
-        <w:t xml:space="preserve"> tra</w:t>
-      </w:r>
-      <w:r>
-        <w:rPr>
-          <w:sz w:val="28"/>
-          <w:szCs w:val="28"/>
-        </w:rPr>
-        <w:t>, các thành viên Đoàn thanh tra</w:t>
-      </w:r>
-      <w:r>
-        <w:rPr>
-          <w:sz w:val="28"/>
-          <w:szCs w:val="28"/>
-        </w:rPr>
-        <w:t>, ki</w:t>
-      </w:r>
-      <w:r>
-        <w:rPr>
-          <w:sz w:val="28"/>
-          <w:szCs w:val="28"/>
-        </w:rPr>
-        <w:t>ểm</w:t>
-      </w:r>
-      <w:r>
-        <w:rPr>
-          <w:sz w:val="28"/>
-          <w:szCs w:val="28"/>
-        </w:rPr>
-        <w:t xml:space="preserve"> tra</w:t>
-      </w:r>
-      <w:r>
-        <w:rPr>
-          <w:sz w:val="28"/>
-          <w:szCs w:val="28"/>
-        </w:rPr>
-        <w:t>, bao gồm: quy định về những điều cấm trong hoạt động thanh tra</w:t>
-      </w:r>
-      <w:r>
-        <w:rPr>
-          <w:sz w:val="28"/>
-          <w:szCs w:val="28"/>
-        </w:rPr>
-        <w:t>, ki</w:t>
-      </w:r>
-      <w:r>
-        <w:rPr>
-          <w:sz w:val="28"/>
-          <w:szCs w:val="28"/>
-        </w:rPr>
-        <w:t>ểm</w:t>
-      </w:r>
-      <w:r>
-        <w:rPr>
-          <w:sz w:val="28"/>
-          <w:szCs w:val="28"/>
-        </w:rPr>
-        <w:t xml:space="preserve"> tra thu</w:t>
-      </w:r>
-      <w:r>
-        <w:rPr>
-          <w:sz w:val="28"/>
-          <w:szCs w:val="28"/>
-        </w:rPr>
-        <w:t>ế</w:t>
-      </w:r>
-      <w:r>
-        <w:rPr>
-          <w:sz w:val="28"/>
-          <w:szCs w:val="28"/>
-        </w:rPr>
-        <w:t>; quy tắc ứng xử của cán bộ thanh tra</w:t>
-      </w:r>
-      <w:r>
-        <w:rPr>
-          <w:sz w:val="28"/>
-          <w:szCs w:val="28"/>
-        </w:rPr>
-        <w:t>, ki</w:t>
-      </w:r>
-      <w:r>
-        <w:rPr>
-          <w:sz w:val="28"/>
-          <w:szCs w:val="28"/>
-        </w:rPr>
-        <w:t>ểm</w:t>
-      </w:r>
-      <w:r>
-        <w:rPr>
-          <w:sz w:val="28"/>
-          <w:szCs w:val="28"/>
-        </w:rPr>
-        <w:t xml:space="preserve"> </w:t>
+        <w:t xml:space="preserve">- Việc thực hiện các quy định của pháp luật đối với trưởng đoàn, thành viên đoàn thanh tra, kiểm tra, bao gồm: quy định về những điều cấm trong hoạt động </w:t>
       </w:r>
       <w:r>
         <w:rPr>
@@ -1550,56 +842,7 @@
           <w:szCs w:val="28"/>
         </w:rPr>
         <w:lastRenderedPageBreak/>
-        <w:t>tra thu</w:t>
-      </w:r>
-      <w:r>
-        <w:rPr>
-          <w:sz w:val="28"/>
-          <w:szCs w:val="28"/>
-        </w:rPr>
-        <w:t>ế</w:t>
-      </w:r>
-      <w:r>
-        <w:rPr>
-          <w:sz w:val="28"/>
-          <w:szCs w:val="28"/>
-        </w:rPr>
-        <w:t>; ý thức chấp hành kỷ luật thanh tra</w:t>
-      </w:r>
-      <w:r>
-        <w:rPr>
-          <w:sz w:val="28"/>
-          <w:szCs w:val="28"/>
-        </w:rPr>
-        <w:t>, ki</w:t>
-      </w:r>
-      <w:r>
-        <w:rPr>
-          <w:sz w:val="28"/>
-          <w:szCs w:val="28"/>
-        </w:rPr>
-        <w:t>ểm</w:t>
-      </w:r>
-      <w:r>
-        <w:rPr>
-          <w:sz w:val="28"/>
-          <w:szCs w:val="28"/>
-        </w:rPr>
-        <w:t xml:space="preserve"> tra thu</w:t>
-      </w:r>
-      <w:r>
-        <w:rPr>
-          <w:sz w:val="28"/>
-          <w:szCs w:val="28"/>
-        </w:rPr>
-        <w:t>ế</w:t>
-      </w:r>
-      <w:r>
-        <w:rPr>
-          <w:sz w:val="28"/>
-          <w:szCs w:val="28"/>
-        </w:rPr>
-        <w:t xml:space="preserve"> và các quy định khác có liên quan.</w:t>
+        <w:t>thanh tra, kiểm tra thuế; quy tắc ứng xử của cán bộ thanh tra, kiểm tra thuế; ý thức chấp hành kỷ luật thanh tra, kiểm tra thuế và các quy định khác có liên quan.</w:t>
       </w:r>
     </w:p>
     <w:p>
@@ -1618,77 +861,7 @@
           <w:sz w:val="28"/>
           <w:szCs w:val="28"/>
         </w:rPr>
-        <w:t>2. Giám sát việc thực hiện nhiệm vụ và triển khai hoạt động thanh tra</w:t>
-      </w:r>
-      <w:r>
-        <w:rPr>
-          <w:sz w:val="28"/>
-          <w:szCs w:val="28"/>
-        </w:rPr>
-        <w:t>, ki</w:t>
-      </w:r>
-      <w:r>
-        <w:rPr>
-          <w:sz w:val="28"/>
-          <w:szCs w:val="28"/>
-        </w:rPr>
-        <w:t>ểm</w:t>
-      </w:r>
-      <w:r>
-        <w:rPr>
-          <w:sz w:val="28"/>
-          <w:szCs w:val="28"/>
-        </w:rPr>
-        <w:t xml:space="preserve"> tra thu</w:t>
-      </w:r>
-      <w:r>
-        <w:rPr>
-          <w:sz w:val="28"/>
-          <w:szCs w:val="28"/>
-        </w:rPr>
-        <w:t>ế</w:t>
-      </w:r>
-      <w:r>
-        <w:rPr>
-          <w:sz w:val="28"/>
-          <w:szCs w:val="28"/>
-        </w:rPr>
-        <w:t xml:space="preserve"> của Đoàn thanh tra</w:t>
-      </w:r>
-      <w:r>
-        <w:rPr>
-          <w:sz w:val="28"/>
-          <w:szCs w:val="28"/>
-        </w:rPr>
-        <w:t>, ki</w:t>
-      </w:r>
-      <w:r>
-        <w:rPr>
-          <w:sz w:val="28"/>
-          <w:szCs w:val="28"/>
-        </w:rPr>
-        <w:t>ểm</w:t>
-      </w:r>
-      <w:r>
-        <w:rPr>
-          <w:sz w:val="28"/>
-          <w:szCs w:val="28"/>
-        </w:rPr>
-        <w:t xml:space="preserve"> tra thu</w:t>
-      </w:r>
-      <w:r>
-        <w:rPr>
-          <w:sz w:val="28"/>
-          <w:szCs w:val="28"/>
-        </w:rPr>
-        <w:t>ế</w:t>
-      </w:r>
-      <w:r>
-        <w:rPr>
-          <w:sz w:val="28"/>
-          <w:szCs w:val="28"/>
-        </w:rPr>
-        <w:t xml:space="preserve"> bao gồm các nội dung sau:</w:t>
+        <w:t>2. Giám sát việc thực hiện nhiệm vụ và triển khai hoạt động thanh tra, kiểm tra thuế của đoàn thanh tra, kiểm tra thuế bao gồm các nội dung sau:</w:t>
       </w:r>
     </w:p>
     <w:p>
@@ -1707,98 +880,7 @@
           <w:sz w:val="28"/>
           <w:szCs w:val="28"/>
         </w:rPr>
-        <w:t>-</w:t>
-      </w:r>
-      <w:r>
-        <w:rPr>
-          <w:sz w:val="28"/>
-          <w:szCs w:val="28"/>
-        </w:rPr>
-        <w:t xml:space="preserve"> Tiến độ và kết quả đã đạt được so với yêu cầu theo quyết định thanh tra, </w:t>
-      </w:r>
-      <w:r>
-        <w:rPr>
-          <w:sz w:val="28"/>
-          <w:szCs w:val="28"/>
-        </w:rPr>
-        <w:t>ki</w:t>
-      </w:r>
-      <w:r>
-        <w:rPr>
-          <w:sz w:val="28"/>
-          <w:szCs w:val="28"/>
-        </w:rPr>
-        <w:t>ểm</w:t>
-      </w:r>
-      <w:r>
-        <w:rPr>
-          <w:sz w:val="28"/>
-          <w:szCs w:val="28"/>
-        </w:rPr>
-        <w:t xml:space="preserve"> tra thu</w:t>
-      </w:r>
-      <w:r>
-        <w:rPr>
-          <w:sz w:val="28"/>
-          <w:szCs w:val="28"/>
-        </w:rPr>
-        <w:t>ế</w:t>
-      </w:r>
-      <w:r>
-        <w:rPr>
-          <w:sz w:val="28"/>
-          <w:szCs w:val="28"/>
-        </w:rPr>
-        <w:t xml:space="preserve">; </w:t>
-      </w:r>
-      <w:r>
-        <w:rPr>
-          <w:sz w:val="28"/>
-          <w:szCs w:val="28"/>
-        </w:rPr>
-        <w:t>kế hoạch tiến hành thanh tra</w:t>
-      </w:r>
-      <w:r>
-        <w:rPr>
-          <w:sz w:val="28"/>
-          <w:szCs w:val="28"/>
-        </w:rPr>
-        <w:t>, n</w:t>
-      </w:r>
-      <w:r>
-        <w:rPr>
-          <w:sz w:val="28"/>
-          <w:szCs w:val="28"/>
-        </w:rPr>
-        <w:t>ội</w:t>
-      </w:r>
-      <w:r>
-        <w:rPr>
-          <w:sz w:val="28"/>
-          <w:szCs w:val="28"/>
-        </w:rPr>
-        <w:t xml:space="preserve"> dung ki</w:t>
-      </w:r>
-      <w:r>
-        <w:rPr>
-          <w:sz w:val="28"/>
-          <w:szCs w:val="28"/>
-        </w:rPr>
-        <w:t>ểm</w:t>
-      </w:r>
-      <w:r>
-        <w:rPr>
-          <w:sz w:val="28"/>
-          <w:szCs w:val="28"/>
-        </w:rPr>
-        <w:t xml:space="preserve"> tra</w:t>
-      </w:r>
-      <w:r>
-        <w:rPr>
-          <w:sz w:val="28"/>
-          <w:szCs w:val="28"/>
-        </w:rPr>
-        <w:t>;</w:t>
+        <w:t>- Tiến độ và kết quả đã đạt được so với yêu cầu theo quyết định thanh tra, kiểm tra; kế hoạch tiến hành thanh tra, kiểm tra;</w:t>
       </w:r>
     </w:p>
     <w:p>
@@ -1817,91 +899,7 @@
           <w:sz w:val="28"/>
           <w:szCs w:val="28"/>
         </w:rPr>
-        <w:t>-</w:t>
-      </w:r>
-      <w:r>
-        <w:rPr>
-          <w:sz w:val="28"/>
-          <w:szCs w:val="28"/>
-        </w:rPr>
-        <w:t xml:space="preserve"> Khó khăn, vướng mắc phát sinh trong hoạt động thanh tra</w:t>
-      </w:r>
-      <w:r>
-        <w:rPr>
-          <w:sz w:val="28"/>
-          <w:szCs w:val="28"/>
-        </w:rPr>
-        <w:t>, ki</w:t>
-      </w:r>
-      <w:r>
-        <w:rPr>
-          <w:sz w:val="28"/>
-          <w:szCs w:val="28"/>
-        </w:rPr>
-        <w:t>ểm</w:t>
-      </w:r>
-      <w:r>
-        <w:rPr>
-          <w:sz w:val="28"/>
-          <w:szCs w:val="28"/>
-        </w:rPr>
-        <w:t xml:space="preserve"> tra thu</w:t>
-      </w:r>
-      <w:r>
-        <w:rPr>
-          <w:sz w:val="28"/>
-          <w:szCs w:val="28"/>
-        </w:rPr>
-        <w:t>ế</w:t>
-      </w:r>
-      <w:r>
-        <w:rPr>
-          <w:sz w:val="28"/>
-          <w:szCs w:val="28"/>
-        </w:rPr>
-        <w:t xml:space="preserve"> và tác động đối với việc hoàn thành kế hoạch tiến hành thanh tra</w:t>
-      </w:r>
-      <w:r>
-        <w:rPr>
-          <w:sz w:val="28"/>
-          <w:szCs w:val="28"/>
-        </w:rPr>
-        <w:t>, n</w:t>
-      </w:r>
-      <w:r>
-        <w:rPr>
-          <w:sz w:val="28"/>
-          <w:szCs w:val="28"/>
-        </w:rPr>
-        <w:t>ội</w:t>
-      </w:r>
-      <w:r>
-        <w:rPr>
-          <w:sz w:val="28"/>
-          <w:szCs w:val="28"/>
-        </w:rPr>
-        <w:t xml:space="preserve"> dung ki</w:t>
-      </w:r>
-      <w:r>
-        <w:rPr>
-          <w:sz w:val="28"/>
-          <w:szCs w:val="28"/>
-        </w:rPr>
-        <w:t>ểm</w:t>
-      </w:r>
-      <w:r>
-        <w:rPr>
-          <w:sz w:val="28"/>
-          <w:szCs w:val="28"/>
-        </w:rPr>
-        <w:t xml:space="preserve"> tra</w:t>
-      </w:r>
-      <w:r>
-        <w:rPr>
-          <w:sz w:val="28"/>
-          <w:szCs w:val="28"/>
-        </w:rPr>
-        <w:t>;</w:t>
+        <w:t>- Khó khăn, vướng mắc phát sinh trong hoạt động thanh tra, kiểm tra thuế và tác động đối với việc hoàn thành kế hoạch thanh tra, kiểm tra;</w:t>
       </w:r>
     </w:p>
     <w:p>
@@ -1917,131 +915,10 @@
       </w:pPr>
       <w:r>
         <w:rPr>
-          <w:rFonts w:ascii="Arial" w:hAnsi="Arial" w:cs="Arial"/>
-          <w:color w:val="000000"/>
-          <w:sz w:val="24"/>
-          <w:szCs w:val="24"/>
-        </w:rPr>
-        <w:t>-</w:t>
-      </w:r>
-      <w:r>
-        <w:rPr>
-          <w:sz w:val="28"/>
-          <w:szCs w:val="28"/>
-        </w:rPr>
-        <w:t xml:space="preserve"> Việc thực hiện nhiệm vụ, triển khai hoạt động thanh tra</w:t>
-      </w:r>
-      <w:r>
-        <w:rPr>
-          <w:sz w:val="28"/>
-          <w:szCs w:val="28"/>
-        </w:rPr>
-        <w:t>, ki</w:t>
-      </w:r>
-      <w:r>
-        <w:rPr>
-          <w:sz w:val="28"/>
-          <w:szCs w:val="28"/>
-        </w:rPr>
-        <w:t>ểm</w:t>
-      </w:r>
-      <w:r>
-        <w:rPr>
-          <w:sz w:val="28"/>
-          <w:szCs w:val="28"/>
-        </w:rPr>
-        <w:t xml:space="preserve"> tra thu</w:t>
-      </w:r>
-      <w:r>
-        <w:rPr>
-          <w:sz w:val="28"/>
-          <w:szCs w:val="28"/>
-        </w:rPr>
-        <w:t>ế</w:t>
-      </w:r>
-      <w:r>
-        <w:rPr>
-          <w:sz w:val="28"/>
-          <w:szCs w:val="28"/>
-        </w:rPr>
-        <w:t xml:space="preserve"> của Trưởng đoàn thanh tra</w:t>
-      </w:r>
-      <w:r>
-        <w:rPr>
-          <w:sz w:val="28"/>
-          <w:szCs w:val="28"/>
-        </w:rPr>
-        <w:t>, ki</w:t>
-      </w:r>
-      <w:r>
-        <w:rPr>
-          <w:sz w:val="28"/>
-          <w:szCs w:val="28"/>
-        </w:rPr>
-        <w:t>ểm</w:t>
-      </w:r>
-      <w:r>
-        <w:rPr>
-          <w:sz w:val="28"/>
-          <w:szCs w:val="28"/>
-        </w:rPr>
-        <w:t xml:space="preserve"> tra thu</w:t>
-      </w:r>
-      <w:r>
-        <w:rPr>
-          <w:sz w:val="28"/>
-          <w:szCs w:val="28"/>
-        </w:rPr>
-        <w:t>ế</w:t>
-      </w:r>
-      <w:r>
-        <w:rPr>
-          <w:sz w:val="28"/>
-          <w:szCs w:val="28"/>
-        </w:rPr>
-        <w:t>;</w:t>
-      </w:r>
-      <w:r>
-        <w:rPr>
-          <w:sz w:val="28"/>
-          <w:szCs w:val="28"/>
-        </w:rPr>
-        <w:t xml:space="preserve"> thành viên Đoàn thanh tra</w:t>
-      </w:r>
-      <w:r>
-        <w:rPr>
-          <w:sz w:val="28"/>
-          <w:szCs w:val="28"/>
-        </w:rPr>
-        <w:t>, ki</w:t>
-      </w:r>
-      <w:r>
-        <w:rPr>
-          <w:sz w:val="28"/>
-          <w:szCs w:val="28"/>
-        </w:rPr>
-        <w:t>ểm</w:t>
-      </w:r>
-      <w:r>
-        <w:rPr>
-          <w:sz w:val="28"/>
-          <w:szCs w:val="28"/>
-        </w:rPr>
-        <w:t xml:space="preserve"> tra thu</w:t>
-      </w:r>
-      <w:r>
-        <w:rPr>
-          <w:sz w:val="28"/>
-          <w:szCs w:val="28"/>
-        </w:rPr>
-        <w:t>ế</w:t>
-      </w:r>
-      <w:r>
-        <w:rPr>
-          <w:sz w:val="28"/>
-          <w:szCs w:val="28"/>
-        </w:rPr>
-        <w:t>;</w:t>
+          <w:sz w:val="28"/>
+          <w:szCs w:val="28"/>
+        </w:rPr>
+        <w:t>- Việc thực hiện nhiệm vụ, triển khai hoạt động của trưởng đoàn, thành viên đoàn thanh tra, kiểm tra thuế;</w:t>
       </w:r>
     </w:p>
     <w:p>
@@ -2060,112 +937,7 @@
           <w:sz w:val="28"/>
           <w:szCs w:val="28"/>
         </w:rPr>
-        <w:t>-</w:t>
-      </w:r>
-      <w:r>
-        <w:rPr>
-          <w:sz w:val="28"/>
-          <w:szCs w:val="28"/>
-        </w:rPr>
-        <w:t xml:space="preserve"> Việc xử lý ý kiến khác nhau giữa các thành viên Đoàn thanh tra</w:t>
-      </w:r>
-      <w:r>
-        <w:rPr>
-          <w:sz w:val="28"/>
-          <w:szCs w:val="28"/>
-        </w:rPr>
-        <w:t>, ki</w:t>
-      </w:r>
-      <w:r>
-        <w:rPr>
-          <w:sz w:val="28"/>
-          <w:szCs w:val="28"/>
-        </w:rPr>
-        <w:t>ểm</w:t>
-      </w:r>
-      <w:r>
-        <w:rPr>
-          <w:sz w:val="28"/>
-          <w:szCs w:val="28"/>
-        </w:rPr>
-        <w:t xml:space="preserve"> tra thu</w:t>
-      </w:r>
-      <w:r>
-        <w:rPr>
-          <w:sz w:val="28"/>
-          <w:szCs w:val="28"/>
-        </w:rPr>
-        <w:t>ế</w:t>
-      </w:r>
-      <w:r>
-        <w:rPr>
-          <w:sz w:val="28"/>
-          <w:szCs w:val="28"/>
-        </w:rPr>
-        <w:t xml:space="preserve"> và Trưởng đoàn </w:t>
-      </w:r>
-      <w:r>
-        <w:rPr>
-          <w:sz w:val="28"/>
-          <w:szCs w:val="28"/>
-        </w:rPr>
-        <w:t>kiểm tra</w:t>
-      </w:r>
-      <w:r>
-        <w:rPr>
-          <w:sz w:val="28"/>
-          <w:szCs w:val="28"/>
-        </w:rPr>
-        <w:t>ki</w:t>
-      </w:r>
-      <w:r>
-        <w:rPr>
-          <w:sz w:val="28"/>
-          <w:szCs w:val="28"/>
-        </w:rPr>
-        <w:t>ểm</w:t>
-      </w:r>
-      <w:r>
-        <w:rPr>
-          <w:sz w:val="28"/>
-          <w:szCs w:val="28"/>
-        </w:rPr>
-        <w:t xml:space="preserve"> tra thu</w:t>
-      </w:r>
-      <w:r>
-        <w:rPr>
-          <w:sz w:val="28"/>
-          <w:szCs w:val="28"/>
-        </w:rPr>
-        <w:t>ế</w:t>
-      </w:r>
-      <w:r>
-        <w:rPr>
-          <w:sz w:val="28"/>
-          <w:szCs w:val="28"/>
-        </w:rPr>
-        <w:t xml:space="preserve"> về những vấn đề l</w:t>
-      </w:r>
-      <w:r>
-        <w:rPr>
-          <w:sz w:val="28"/>
-          <w:szCs w:val="28"/>
-        </w:rPr>
-        <w:t>iên quan đến nội dung thanh tra, ki</w:t>
-      </w:r>
-      <w:r>
-        <w:rPr>
-          <w:sz w:val="28"/>
-          <w:szCs w:val="28"/>
-        </w:rPr>
-        <w:t>ểm</w:t>
-      </w:r>
-      <w:r>
-        <w:rPr>
-          <w:sz w:val="28"/>
-          <w:szCs w:val="28"/>
-        </w:rPr>
-        <w:t xml:space="preserve"> tra;</w:t>
+        <w:t>- Việc xử lý ý kiến khác nhau giữa các thành viên và trưởng đoàn về những vấn đề liên quan đến nội dung thanh tra, kiểm tra;</w:t>
       </w:r>
     </w:p>
     <w:p>
@@ -2184,84 +956,7 @@
           <w:sz w:val="28"/>
           <w:szCs w:val="28"/>
         </w:rPr>
-        <w:t>-</w:t>
-      </w:r>
-      <w:r>
-        <w:rPr>
-          <w:sz w:val="28"/>
-          <w:szCs w:val="28"/>
-        </w:rPr>
-        <w:t xml:space="preserve"> Các nội dung khác có liên quan đến việc thực hiện nhiệm vụ, triển khai hoạt động thanh tra</w:t>
-      </w:r>
-      <w:r>
-        <w:rPr>
-          <w:sz w:val="28"/>
-          <w:szCs w:val="28"/>
-        </w:rPr>
-        <w:t>, ki</w:t>
-      </w:r>
-      <w:r>
-        <w:rPr>
-          <w:sz w:val="28"/>
-          <w:szCs w:val="28"/>
-        </w:rPr>
-        <w:t>ểm</w:t>
-      </w:r>
-      <w:r>
-        <w:rPr>
-          <w:sz w:val="28"/>
-          <w:szCs w:val="28"/>
-        </w:rPr>
-        <w:t xml:space="preserve"> tra thu</w:t>
-      </w:r>
-      <w:r>
-        <w:rPr>
-          <w:sz w:val="28"/>
-          <w:szCs w:val="28"/>
-        </w:rPr>
-        <w:t>ế</w:t>
-      </w:r>
-      <w:r>
-        <w:rPr>
-          <w:sz w:val="28"/>
-          <w:szCs w:val="28"/>
-        </w:rPr>
-        <w:t xml:space="preserve"> của Đoàn thanh tra</w:t>
-      </w:r>
-      <w:r>
-        <w:rPr>
-          <w:sz w:val="28"/>
-          <w:szCs w:val="28"/>
-        </w:rPr>
-        <w:t>, ki</w:t>
-      </w:r>
-      <w:r>
-        <w:rPr>
-          <w:sz w:val="28"/>
-          <w:szCs w:val="28"/>
-        </w:rPr>
-        <w:t>ể</w:t>
-      </w:r>
-      <w:r>
-        <w:rPr>
-          <w:sz w:val="28"/>
-          <w:szCs w:val="28"/>
-        </w:rPr>
-        <w:t>m tra thu</w:t>
-      </w:r>
-      <w:r>
-        <w:rPr>
-          <w:sz w:val="28"/>
-          <w:szCs w:val="28"/>
-        </w:rPr>
-        <w:t>ế</w:t>
-      </w:r>
-      <w:r>
-        <w:rPr>
-          <w:sz w:val="28"/>
-          <w:szCs w:val="28"/>
-        </w:rPr>
-        <w:t>.</w:t>
+        <w:t>- Các nội dung khác có liên quan đến việc thực hiện nhiệm vụ, triển khai hoạt động của đoàn thanh tra, kiểm tra thuế.</w:t>
       </w:r>
     </w:p>
     <w:p>
@@ -2309,77 +1004,14 @@
           <w:sz w:val="28"/>
           <w:szCs w:val="28"/>
         </w:rPr>
-        <w:t xml:space="preserve">Thực hiện theo quy định tại Điều 14 của quy chế giám sát hoạt động của đoàn </w:t>
-      </w:r>
-      <w:r>
-        <w:rPr>
-          <w:sz w:val="28"/>
-          <w:szCs w:val="28"/>
-        </w:rPr>
-        <w:t>kiểm tra</w:t>
-      </w:r>
-      <w:r>
-        <w:rPr>
-          <w:sz w:val="28"/>
-          <w:szCs w:val="28"/>
-        </w:rPr>
-        <w:t>ki</w:t>
-      </w:r>
-      <w:r>
-        <w:rPr>
-          <w:sz w:val="28"/>
-          <w:szCs w:val="28"/>
-        </w:rPr>
-        <w:t>ểm</w:t>
-      </w:r>
-      <w:r>
-        <w:rPr>
-          <w:sz w:val="28"/>
-          <w:szCs w:val="28"/>
-        </w:rPr>
-        <w:t xml:space="preserve"> tra </w:t>
-      </w:r>
-      <w:r>
-        <w:rPr>
-          <w:sz w:val="28"/>
-          <w:szCs w:val="28"/>
-        </w:rPr>
-        <w:t>thuế (kèm theo Quyết định số 1</w:t>
-      </w:r>
-      <w:r>
-        <w:rPr>
-          <w:sz w:val="28"/>
-          <w:szCs w:val="28"/>
-        </w:rPr>
-        <w:t>614</w:t>
-      </w:r>
-      <w:r>
-        <w:rPr>
-          <w:sz w:val="28"/>
-          <w:szCs w:val="28"/>
-        </w:rPr>
-        <w:t xml:space="preserve">/QĐ-TCT ngày </w:t>
-      </w:r>
-      <w:r>
-        <w:rPr>
-          <w:sz w:val="28"/>
-          <w:szCs w:val="28"/>
-        </w:rPr>
-        <w:t>13/10/2020</w:t>
-      </w:r>
-      <w:r>
-        <w:rPr>
-          <w:sz w:val="28"/>
-          <w:szCs w:val="28"/>
-        </w:rPr>
-        <w:t xml:space="preserve"> của Tổng cục trưởng Tổng cục Thuế)</w:t>
-      </w:r>
-      <w:r>
-        <w:rPr>
-          <w:sz w:val="28"/>
-          <w:szCs w:val="28"/>
-        </w:rPr>
-        <w:t>.</w:t>
+        <w:t>Thực hiện theo quy định tại Điều 14 của quy chế giám sát hoạt động của đoàn thanh tra, kiểm tra (kèm theo Quyết định 1614/QĐ-TCT ngày 13/10/2020 của Tổng cục Thuế</w:t>
+      </w:r>
+      <w:r>
+        <w:rPr>
+          <w:sz w:val="28"/>
+          <w:szCs w:val="28"/>
+        </w:rPr>
+        <w:t>).</w:t>
       </w:r>
       <w:r>
         <w:rPr>
@@ -2426,126 +1058,7 @@
           <w:sz w:val="28"/>
           <w:szCs w:val="28"/>
         </w:rPr>
-        <w:t>- Tiến độ thực hiện:</w:t>
-      </w:r>
-      <w:r>
-        <w:rPr>
-          <w:sz w:val="28"/>
-          <w:szCs w:val="28"/>
-        </w:rPr>
-        <w:t xml:space="preserve"> </w:t>
-      </w:r>
-      <w:r>
-        <w:rPr>
-          <w:sz w:val="28"/>
-          <w:szCs w:val="28"/>
-        </w:rPr>
-        <w:t xml:space="preserve">tính từ ngày Đoàn </w:t>
-      </w:r>
-      <w:r>
-        <w:rPr>
-          <w:sz w:val="28"/>
-          <w:szCs w:val="28"/>
-        </w:rPr>
-        <w:t>ki</w:t>
-      </w:r>
-      <w:r>
-        <w:rPr>
-          <w:sz w:val="28"/>
-          <w:szCs w:val="28"/>
-        </w:rPr>
-        <w:t>ểm</w:t>
-      </w:r>
-      <w:r>
-        <w:rPr>
-          <w:sz w:val="28"/>
-          <w:szCs w:val="28"/>
-        </w:rPr>
-        <w:t xml:space="preserve"> tra</w:t>
-      </w:r>
-      <w:r>
-        <w:rPr>
-          <w:sz w:val="28"/>
-          <w:szCs w:val="28"/>
-        </w:rPr>
-        <w:t xml:space="preserve"> thuế công bố Quyết định </w:t>
-      </w:r>
-      <w:r>
-        <w:rPr>
-          <w:sz w:val="28"/>
-          <w:szCs w:val="28"/>
-        </w:rPr>
-        <w:t>ki</w:t>
-      </w:r>
-      <w:r>
-        <w:rPr>
-          <w:sz w:val="28"/>
-          <w:szCs w:val="28"/>
-        </w:rPr>
-        <w:t>ểm</w:t>
-      </w:r>
-      <w:r>
-        <w:rPr>
-          <w:sz w:val="28"/>
-          <w:szCs w:val="28"/>
-        </w:rPr>
-        <w:t xml:space="preserve"> tra </w:t>
-      </w:r>
-      <w:r>
-        <w:rPr>
-          <w:sz w:val="28"/>
-          <w:szCs w:val="28"/>
-        </w:rPr>
-        <w:t>trư</w:t>
-      </w:r>
-      <w:r>
-        <w:rPr>
-          <w:sz w:val="28"/>
-          <w:szCs w:val="28"/>
-        </w:rPr>
-        <w:t>ớ</w:t>
-      </w:r>
-      <w:r>
-        <w:rPr>
-          <w:sz w:val="28"/>
-          <w:szCs w:val="28"/>
-        </w:rPr>
-        <w:t>c ho</w:t>
-      </w:r>
-      <w:r>
-        <w:rPr>
-          <w:sz w:val="28"/>
-          <w:szCs w:val="28"/>
-        </w:rPr>
-        <w:t>àn</w:t>
-      </w:r>
-      <w:r>
-        <w:rPr>
-          <w:sz w:val="28"/>
-          <w:szCs w:val="28"/>
-        </w:rPr>
-        <w:t xml:space="preserve"> </w:t>
-      </w:r>
-      <w:r>
-        <w:rPr>
-          <w:sz w:val="28"/>
-          <w:szCs w:val="28"/>
-        </w:rPr>
-        <w:t>thu</w:t>
-      </w:r>
-      <w:r>
-        <w:rPr>
-          <w:sz w:val="28"/>
-          <w:szCs w:val="28"/>
-        </w:rPr>
-        <w:t>ế</w:t>
-      </w:r>
-      <w:r>
-        <w:rPr>
-          <w:sz w:val="28"/>
-          <w:szCs w:val="28"/>
-        </w:rPr>
-        <w:t xml:space="preserve"> tại trụ sở của NNT.</w:t>
+        <w:t>- Tiến độ thực hiện: tính từ ngày đoàn thanh tra, kiểm tra thuế công bố Quyết định thanh tra, kiểm tra tại trụ sở của NNT.</w:t>
       </w:r>
     </w:p>
     <w:p>
@@ -2564,77 +1077,7 @@
           <w:sz w:val="28"/>
           <w:szCs w:val="28"/>
         </w:rPr>
-        <w:t>- Chế độ thông tin, báo cáo:</w:t>
-      </w:r>
-      <w:r>
-        <w:rPr>
-          <w:sz w:val="28"/>
-          <w:szCs w:val="28"/>
-        </w:rPr>
-        <w:t xml:space="preserve"> thực hiện theo </w:t>
-      </w:r>
-      <w:r>
-        <w:rPr>
-          <w:sz w:val="28"/>
-          <w:szCs w:val="28"/>
-        </w:rPr>
-        <w:t>quy định tại Điều 17 của quy chế giám sát hoạt động của đoàn thanh tra</w:t>
-      </w:r>
-      <w:r>
-        <w:rPr>
-          <w:sz w:val="28"/>
-          <w:szCs w:val="28"/>
-        </w:rPr>
-        <w:t>, ki</w:t>
-      </w:r>
-      <w:r>
-        <w:rPr>
-          <w:sz w:val="28"/>
-          <w:szCs w:val="28"/>
-        </w:rPr>
-        <w:t>ểm</w:t>
-      </w:r>
-      <w:r>
-        <w:rPr>
-          <w:sz w:val="28"/>
-          <w:szCs w:val="28"/>
-        </w:rPr>
-        <w:t xml:space="preserve"> tra</w:t>
-      </w:r>
-      <w:r>
-        <w:rPr>
-          <w:sz w:val="28"/>
-          <w:szCs w:val="28"/>
-        </w:rPr>
-        <w:t xml:space="preserve"> thuế (kèm theo Quyết định số </w:t>
-      </w:r>
-      <w:r>
-        <w:rPr>
-          <w:sz w:val="28"/>
-          <w:szCs w:val="28"/>
-        </w:rPr>
-        <w:t>1614</w:t>
-      </w:r>
-      <w:r>
-        <w:rPr>
-          <w:sz w:val="28"/>
-          <w:szCs w:val="28"/>
-        </w:rPr>
-        <w:t xml:space="preserve">/QĐ-TCT ngày </w:t>
-      </w:r>
-      <w:r>
-        <w:rPr>
-          <w:sz w:val="28"/>
-          <w:szCs w:val="28"/>
-        </w:rPr>
-        <w:t>13/10/2020</w:t>
-      </w:r>
-      <w:r>
-        <w:rPr>
-          <w:sz w:val="28"/>
-          <w:szCs w:val="28"/>
-        </w:rPr>
-        <w:t xml:space="preserve"> của Tổng cục trưởng Tổng cục Thuế).</w:t>
+        <w:t>- Chế độ thông tin, báo cáo: thực hiện theo quy định tại Điều 17 của quy chế giám sát hoạt động của đoàn thanh tra, kiểm tra thuế (kèm theo Quyết định số 1614/QĐ-TCT ngày 13/10/2020 của Tổng cục Thuế).</w:t>
       </w:r>
     </w:p>
     <w:p>
@@ -2653,14 +1096,7 @@
           <w:sz w:val="28"/>
           <w:szCs w:val="28"/>
         </w:rPr>
-        <w:t>- Điều kiện vật chất đảm bảo hoạt động giám sát:</w:t>
-      </w:r>
-      <w:r>
-        <w:rPr>
-          <w:sz w:val="28"/>
-          <w:szCs w:val="28"/>
-        </w:rPr>
-        <w:t xml:space="preserve"> máy tính để bàn, Laptop, điện thoại.</w:t>
+        <w:t>- Điều kiện vật chất đảm bảo hoạt động giám sát: máy tính để bàn, Laptop, điện thoại.</w:t>
       </w:r>
     </w:p>
     <w:p>
@@ -2679,14 +1115,7 @@
           <w:sz w:val="28"/>
           <w:szCs w:val="28"/>
         </w:rPr>
-        <w:t>- Những vấn đề khác (nếu có):</w:t>
-      </w:r>
-      <w:r>
-        <w:rPr>
-          <w:sz w:val="28"/>
-          <w:szCs w:val="28"/>
-        </w:rPr>
-        <w:t xml:space="preserve"> không.</w:t>
+        <w:t>- Những vấn đề khác (nếu có): không.</w:t>
       </w:r>
     </w:p>
     <w:p>
@@ -2982,7 +1411,7 @@
 </file>
 
 <file path=word/endnotes.xml><?xml version="1.0" encoding="utf-8"?>
-<w:endnotes xmlns:wpc="http://schemas.microsoft.com/office/word/2010/wordprocessingCanvas" xmlns:cx="http://schemas.microsoft.com/office/drawing/2014/chartex" xmlns:cx1="http://schemas.microsoft.com/office/drawing/2015/9/8/chartex" xmlns:cx2="http://schemas.microsoft.com/office/drawing/2015/10/21/chartex" xmlns:cx3="http://schemas.microsoft.com/office/drawing/2016/5/9/chartex" xmlns:cx4="http://schemas.microsoft.com/office/drawing/2016/5/10/chartex" xmlns:cx5="http://schemas.microsoft.com/office/drawing/2016/5/11/chartex" xmlns:cx6="http://schemas.microsoft.com/office/drawing/2016/5/12/chartex" xmlns:cx7="http://schemas.microsoft.com/office/drawing/2016/5/13/chartex" xmlns:cx8="http://schemas.microsoft.com/office/drawing/2016/5/14/chartex" xmlns:mc="http://schemas.openxmlformats.org/markup-compatibility/2006" xmlns:aink="http://schemas.microsoft.com/office/drawing/2016/ink" xmlns:am3d="http://schemas.microsoft.com/office/drawing/2017/model3d" xmlns:o="urn:schemas-microsoft-com:office:office" xmlns:r="http://schemas.openxmlformats.org/officeDocument/2006/relationships" xmlns:m="http://schemas.openxmlformats.org/officeDocument/2006/math" xmlns:v="urn:schemas-microsoft-com:vml" xmlns:wp14="http://schemas.microsoft.com/office/word/2010/wordprocessingDrawing" xmlns:wp="http://schemas.openxmlformats.org/drawingml/2006/wordprocessingDrawing" xmlns:w10="urn:schemas-microsoft-com:office:word" xmlns:w="http://schemas.openxmlformats.org/wordprocessingml/2006/main" xmlns:w14="http://schemas.microsoft.com/office/word/2010/wordml" xmlns:w15="http://schemas.microsoft.com/office/word/2012/wordml" xmlns:w16cex="http://schemas.microsoft.com/office/word/2018/wordml/cex" xmlns:w16cid="http://schemas.microsoft.com/office/word/2016/wordml/cid" xmlns:w16="http://schemas.microsoft.com/office/word/2018/wordml" xmlns:w16sdtdh="http://schemas.microsoft.com/office/word/2020/wordml/sdtdatahash" xmlns:w16se="http://schemas.microsoft.com/office/word/2015/wordml/symex" xmlns:wpg="http://schemas.microsoft.com/office/word/2010/wordprocessingGroup" xmlns:wpi="http://schemas.microsoft.com/office/word/2010/wordprocessingInk" xmlns:wne="http://schemas.microsoft.com/office/word/2006/wordml" xmlns:wps="http://schemas.microsoft.com/office/word/2010/wordprocessingShape" mc:Ignorable="w14 w15 w16se w16cid w16 w16cex w16sdtdh wp14">
+<w:endnotes xmlns:wpc="http://schemas.microsoft.com/office/word/2010/wordprocessingCanvas" xmlns:cx="http://schemas.microsoft.com/office/drawing/2014/chartex" xmlns:cx1="http://schemas.microsoft.com/office/drawing/2015/9/8/chartex" xmlns:cx2="http://schemas.microsoft.com/office/drawing/2015/10/21/chartex" xmlns:cx3="http://schemas.microsoft.com/office/drawing/2016/5/9/chartex" xmlns:cx4="http://schemas.microsoft.com/office/drawing/2016/5/10/chartex" xmlns:cx5="http://schemas.microsoft.com/office/drawing/2016/5/11/chartex" xmlns:cx6="http://schemas.microsoft.com/office/drawing/2016/5/12/chartex" xmlns:cx7="http://schemas.microsoft.com/office/drawing/2016/5/13/chartex" xmlns:cx8="http://schemas.microsoft.com/office/drawing/2016/5/14/chartex" xmlns:mc="http://schemas.openxmlformats.org/markup-compatibility/2006" xmlns:aink="http://schemas.microsoft.com/office/drawing/2016/ink" xmlns:am3d="http://schemas.microsoft.com/office/drawing/2017/model3d" xmlns:o="urn:schemas-microsoft-com:office:office" xmlns:oel="http://schemas.microsoft.com/office/2019/extlst" xmlns:r="http://schemas.openxmlformats.org/officeDocument/2006/relationships" xmlns:m="http://schemas.openxmlformats.org/officeDocument/2006/math" xmlns:v="urn:schemas-microsoft-com:vml" xmlns:wp14="http://schemas.microsoft.com/office/word/2010/wordprocessingDrawing" xmlns:wp="http://schemas.openxmlformats.org/drawingml/2006/wordprocessingDrawing" xmlns:w10="urn:schemas-microsoft-com:office:word" xmlns:w="http://schemas.openxmlformats.org/wordprocessingml/2006/main" xmlns:w14="http://schemas.microsoft.com/office/word/2010/wordml" xmlns:w15="http://schemas.microsoft.com/office/word/2012/wordml" xmlns:w16cex="http://schemas.microsoft.com/office/word/2018/wordml/cex" xmlns:w16cid="http://schemas.microsoft.com/office/word/2016/wordml/cid" xmlns:w16="http://schemas.microsoft.com/office/word/2018/wordml" xmlns:w16du="http://schemas.microsoft.com/office/word/2023/wordml/word16du" xmlns:w16sdtdh="http://schemas.microsoft.com/office/word/2020/wordml/sdtdatahash" xmlns:w16sdtfl="http://schemas.microsoft.com/office/word/2024/wordml/sdtformatlock" xmlns:w16se="http://schemas.microsoft.com/office/word/2015/wordml/symex" xmlns:wpg="http://schemas.microsoft.com/office/word/2010/wordprocessingGroup" xmlns:wpi="http://schemas.microsoft.com/office/word/2010/wordprocessingInk" xmlns:wne="http://schemas.microsoft.com/office/word/2006/wordml" xmlns:wps="http://schemas.microsoft.com/office/word/2010/wordprocessingShape" mc:Ignorable="w14 w15 w16se w16cid w16 w16cex w16sdtdh w16sdtfl w16du wp14">
   <w:endnote w:type="separator" w:id="-1">
     <w:p>
       <w:r>
@@ -3001,7 +1430,7 @@
 </file>
 
 <file path=word/footer1.xml><?xml version="1.0" encoding="utf-8"?>
-<w:ftr xmlns:wpc="http://schemas.microsoft.com/office/word/2010/wordprocessingCanvas" xmlns:cx="http://schemas.microsoft.com/office/drawing/2014/chartex" xmlns:cx1="http://schemas.microsoft.com/office/drawing/2015/9/8/chartex" xmlns:cx2="http://schemas.microsoft.com/office/drawing/2015/10/21/chartex" xmlns:cx3="http://schemas.microsoft.com/office/drawing/2016/5/9/chartex" xmlns:cx4="http://schemas.microsoft.com/office/drawing/2016/5/10/chartex" xmlns:cx5="http://schemas.microsoft.com/office/drawing/2016/5/11/chartex" xmlns:cx6="http://schemas.microsoft.com/office/drawing/2016/5/12/chartex" xmlns:cx7="http://schemas.microsoft.com/office/drawing/2016/5/13/chartex" xmlns:cx8="http://schemas.microsoft.com/office/drawing/2016/5/14/chartex" xmlns:mc="http://schemas.openxmlformats.org/markup-compatibility/2006" xmlns:aink="http://schemas.microsoft.com/office/drawing/2016/ink" xmlns:am3d="http://schemas.microsoft.com/office/drawing/2017/model3d" xmlns:o="urn:schemas-microsoft-com:office:office" xmlns:r="http://schemas.openxmlformats.org/officeDocument/2006/relationships" xmlns:m="http://schemas.openxmlformats.org/officeDocument/2006/math" xmlns:v="urn:schemas-microsoft-com:vml" xmlns:wp14="http://schemas.microsoft.com/office/word/2010/wordprocessingDrawing" xmlns:wp="http://schemas.openxmlformats.org/drawingml/2006/wordprocessingDrawing" xmlns:w10="urn:schemas-microsoft-com:office:word" xmlns:w="http://schemas.openxmlformats.org/wordprocessingml/2006/main" xmlns:w14="http://schemas.microsoft.com/office/word/2010/wordml" xmlns:w15="http://schemas.microsoft.com/office/word/2012/wordml" xmlns:w16cex="http://schemas.microsoft.com/office/word/2018/wordml/cex" xmlns:w16cid="http://schemas.microsoft.com/office/word/2016/wordml/cid" xmlns:w16="http://schemas.microsoft.com/office/word/2018/wordml" xmlns:w16sdtdh="http://schemas.microsoft.com/office/word/2020/wordml/sdtdatahash" xmlns:w16se="http://schemas.microsoft.com/office/word/2015/wordml/symex" xmlns:wpg="http://schemas.microsoft.com/office/word/2010/wordprocessingGroup" xmlns:wpi="http://schemas.microsoft.com/office/word/2010/wordprocessingInk" xmlns:wne="http://schemas.microsoft.com/office/word/2006/wordml" xmlns:wps="http://schemas.microsoft.com/office/word/2010/wordprocessingShape" mc:Ignorable="w14 w15 w16se w16cid w16 w16cex w16sdtdh wp14">
+<w:ftr xmlns:wpc="http://schemas.microsoft.com/office/word/2010/wordprocessingCanvas" xmlns:cx="http://schemas.microsoft.com/office/drawing/2014/chartex" xmlns:cx1="http://schemas.microsoft.com/office/drawing/2015/9/8/chartex" xmlns:cx2="http://schemas.microsoft.com/office/drawing/2015/10/21/chartex" xmlns:cx3="http://schemas.microsoft.com/office/drawing/2016/5/9/chartex" xmlns:cx4="http://schemas.microsoft.com/office/drawing/2016/5/10/chartex" xmlns:cx5="http://schemas.microsoft.com/office/drawing/2016/5/11/chartex" xmlns:cx6="http://schemas.microsoft.com/office/drawing/2016/5/12/chartex" xmlns:cx7="http://schemas.microsoft.com/office/drawing/2016/5/13/chartex" xmlns:cx8="http://schemas.microsoft.com/office/drawing/2016/5/14/chartex" xmlns:mc="http://schemas.openxmlformats.org/markup-compatibility/2006" xmlns:aink="http://schemas.microsoft.com/office/drawing/2016/ink" xmlns:am3d="http://schemas.microsoft.com/office/drawing/2017/model3d" xmlns:o="urn:schemas-microsoft-com:office:office" xmlns:oel="http://schemas.microsoft.com/office/2019/extlst" xmlns:r="http://schemas.openxmlformats.org/officeDocument/2006/relationships" xmlns:m="http://schemas.openxmlformats.org/officeDocument/2006/math" xmlns:v="urn:schemas-microsoft-com:vml" xmlns:wp14="http://schemas.microsoft.com/office/word/2010/wordprocessingDrawing" xmlns:wp="http://schemas.openxmlformats.org/drawingml/2006/wordprocessingDrawing" xmlns:w10="urn:schemas-microsoft-com:office:word" xmlns:w="http://schemas.openxmlformats.org/wordprocessingml/2006/main" xmlns:w14="http://schemas.microsoft.com/office/word/2010/wordml" xmlns:w15="http://schemas.microsoft.com/office/word/2012/wordml" xmlns:w16cex="http://schemas.microsoft.com/office/word/2018/wordml/cex" xmlns:w16cid="http://schemas.microsoft.com/office/word/2016/wordml/cid" xmlns:w16="http://schemas.microsoft.com/office/word/2018/wordml" xmlns:w16du="http://schemas.microsoft.com/office/word/2023/wordml/word16du" xmlns:w16sdtdh="http://schemas.microsoft.com/office/word/2020/wordml/sdtdatahash" xmlns:w16sdtfl="http://schemas.microsoft.com/office/word/2024/wordml/sdtformatlock" xmlns:w16se="http://schemas.microsoft.com/office/word/2015/wordml/symex" xmlns:wpg="http://schemas.microsoft.com/office/word/2010/wordprocessingGroup" xmlns:wpi="http://schemas.microsoft.com/office/word/2010/wordprocessingInk" xmlns:wne="http://schemas.microsoft.com/office/word/2006/wordml" xmlns:wps="http://schemas.microsoft.com/office/word/2010/wordprocessingShape" mc:Ignorable="w14 w15 w16se w16cid w16 w16cex w16sdtdh w16sdtfl w16du wp14">
   <w:p>
     <w:pPr>
       <w:pStyle w:val="Footer"/>
@@ -3036,7 +1465,7 @@
 </file>
 
 <file path=word/footnotes.xml><?xml version="1.0" encoding="utf-8"?>
-<w:footnotes xmlns:wpc="http://schemas.microsoft.com/office/word/2010/wordprocessingCanvas" xmlns:cx="http://schemas.microsoft.com/office/drawing/2014/chartex" xmlns:cx1="http://schemas.microsoft.com/office/drawing/2015/9/8/chartex" xmlns:cx2="http://schemas.microsoft.com/office/drawing/2015/10/21/chartex" xmlns:cx3="http://schemas.microsoft.com/office/drawing/2016/5/9/chartex" xmlns:cx4="http://schemas.microsoft.com/office/drawing/2016/5/10/chartex" xmlns:cx5="http://schemas.microsoft.com/office/drawing/2016/5/11/chartex" xmlns:cx6="http://schemas.microsoft.com/office/drawing/2016/5/12/chartex" xmlns:cx7="http://schemas.microsoft.com/office/drawing/2016/5/13/chartex" xmlns:cx8="http://schemas.microsoft.com/office/drawing/2016/5/14/chartex" xmlns:mc="http://schemas.openxmlformats.org/markup-compatibility/2006" xmlns:aink="http://schemas.microsoft.com/office/drawing/2016/ink" xmlns:am3d="http://schemas.microsoft.com/office/drawing/2017/model3d" xmlns:o="urn:schemas-microsoft-com:office:office" xmlns:r="http://schemas.openxmlformats.org/officeDocument/2006/relationships" xmlns:m="http://schemas.openxmlformats.org/officeDocument/2006/math" xmlns:v="urn:schemas-microsoft-com:vml" xmlns:wp14="http://schemas.microsoft.com/office/word/2010/wordprocessingDrawing" xmlns:wp="http://schemas.openxmlformats.org/drawingml/2006/wordprocessingDrawing" xmlns:w10="urn:schemas-microsoft-com:office:word" xmlns:w="http://schemas.openxmlformats.org/wordprocessingml/2006/main" xmlns:w14="http://schemas.microsoft.com/office/word/2010/wordml" xmlns:w15="http://schemas.microsoft.com/office/word/2012/wordml" xmlns:w16cex="http://schemas.microsoft.com/office/word/2018/wordml/cex" xmlns:w16cid="http://schemas.microsoft.com/office/word/2016/wordml/cid" xmlns:w16="http://schemas.microsoft.com/office/word/2018/wordml" xmlns:w16sdtdh="http://schemas.microsoft.com/office/word/2020/wordml/sdtdatahash" xmlns:w16se="http://schemas.microsoft.com/office/word/2015/wordml/symex" xmlns:wpg="http://schemas.microsoft.com/office/word/2010/wordprocessingGroup" xmlns:wpi="http://schemas.microsoft.com/office/word/2010/wordprocessingInk" xmlns:wne="http://schemas.microsoft.com/office/word/2006/wordml" xmlns:wps="http://schemas.microsoft.com/office/word/2010/wordprocessingShape" mc:Ignorable="w14 w15 w16se w16cid w16 w16cex w16sdtdh wp14">
+<w:footnotes xmlns:wpc="http://schemas.microsoft.com/office/word/2010/wordprocessingCanvas" xmlns:cx="http://schemas.microsoft.com/office/drawing/2014/chartex" xmlns:cx1="http://schemas.microsoft.com/office/drawing/2015/9/8/chartex" xmlns:cx2="http://schemas.microsoft.com/office/drawing/2015/10/21/chartex" xmlns:cx3="http://schemas.microsoft.com/office/drawing/2016/5/9/chartex" xmlns:cx4="http://schemas.microsoft.com/office/drawing/2016/5/10/chartex" xmlns:cx5="http://schemas.microsoft.com/office/drawing/2016/5/11/chartex" xmlns:cx6="http://schemas.microsoft.com/office/drawing/2016/5/12/chartex" xmlns:cx7="http://schemas.microsoft.com/office/drawing/2016/5/13/chartex" xmlns:cx8="http://schemas.microsoft.com/office/drawing/2016/5/14/chartex" xmlns:mc="http://schemas.openxmlformats.org/markup-compatibility/2006" xmlns:aink="http://schemas.microsoft.com/office/drawing/2016/ink" xmlns:am3d="http://schemas.microsoft.com/office/drawing/2017/model3d" xmlns:o="urn:schemas-microsoft-com:office:office" xmlns:oel="http://schemas.microsoft.com/office/2019/extlst" xmlns:r="http://schemas.openxmlformats.org/officeDocument/2006/relationships" xmlns:m="http://schemas.openxmlformats.org/officeDocument/2006/math" xmlns:v="urn:schemas-microsoft-com:vml" xmlns:wp14="http://schemas.microsoft.com/office/word/2010/wordprocessingDrawing" xmlns:wp="http://schemas.openxmlformats.org/drawingml/2006/wordprocessingDrawing" xmlns:w10="urn:schemas-microsoft-com:office:word" xmlns:w="http://schemas.openxmlformats.org/wordprocessingml/2006/main" xmlns:w14="http://schemas.microsoft.com/office/word/2010/wordml" xmlns:w15="http://schemas.microsoft.com/office/word/2012/wordml" xmlns:w16cex="http://schemas.microsoft.com/office/word/2018/wordml/cex" xmlns:w16cid="http://schemas.microsoft.com/office/word/2016/wordml/cid" xmlns:w16="http://schemas.microsoft.com/office/word/2018/wordml" xmlns:w16du="http://schemas.microsoft.com/office/word/2023/wordml/word16du" xmlns:w16sdtdh="http://schemas.microsoft.com/office/word/2020/wordml/sdtdatahash" xmlns:w16sdtfl="http://schemas.microsoft.com/office/word/2024/wordml/sdtformatlock" xmlns:w16se="http://schemas.microsoft.com/office/word/2015/wordml/symex" xmlns:wpg="http://schemas.microsoft.com/office/word/2010/wordprocessingGroup" xmlns:wpi="http://schemas.microsoft.com/office/word/2010/wordprocessingInk" xmlns:wne="http://schemas.microsoft.com/office/word/2006/wordml" xmlns:wps="http://schemas.microsoft.com/office/word/2010/wordprocessingShape" mc:Ignorable="w14 w15 w16se w16cid w16 w16cex w16sdtdh w16sdtfl w16du wp14">
   <w:footnote w:type="separator" w:id="-1">
     <w:p>
       <w:r>
@@ -3055,7 +1484,7 @@
 </file>
 
 <file path=word/numbering.xml><?xml version="1.0" encoding="utf-8"?>
-<w:numbering xmlns:wpc="http://schemas.microsoft.com/office/word/2010/wordprocessingCanvas" xmlns:cx="http://schemas.microsoft.com/office/drawing/2014/chartex" xmlns:cx1="http://schemas.microsoft.com/office/drawing/2015/9/8/chartex" xmlns:cx2="http://schemas.microsoft.com/office/drawing/2015/10/21/chartex" xmlns:cx3="http://schemas.microsoft.com/office/drawing/2016/5/9/chartex" xmlns:cx4="http://schemas.microsoft.com/office/drawing/2016/5/10/chartex" xmlns:cx5="http://schemas.microsoft.com/office/drawing/2016/5/11/chartex" xmlns:cx6="http://schemas.microsoft.com/office/drawing/2016/5/12/chartex" xmlns:cx7="http://schemas.microsoft.com/office/drawing/2016/5/13/chartex" xmlns:cx8="http://schemas.microsoft.com/office/drawing/2016/5/14/chartex" xmlns:mc="http://schemas.openxmlformats.org/markup-compatibility/2006" xmlns:aink="http://schemas.microsoft.com/office/drawing/2016/ink" xmlns:am3d="http://schemas.microsoft.com/office/drawing/2017/model3d" xmlns:o="urn:schemas-microsoft-com:office:office" xmlns:r="http://schemas.openxmlformats.org/officeDocument/2006/relationships" xmlns:m="http://schemas.openxmlformats.org/officeDocument/2006/math" xmlns:v="urn:schemas-microsoft-com:vml" xmlns:wp14="http://schemas.microsoft.com/office/word/2010/wordprocessingDrawing" xmlns:wp="http://schemas.openxmlformats.org/drawingml/2006/wordprocessingDrawing" xmlns:w10="urn:schemas-microsoft-com:office:word" xmlns:w="http://schemas.openxmlformats.org/wordprocessingml/2006/main" xmlns:w14="http://schemas.microsoft.com/office/word/2010/wordml" xmlns:w15="http://schemas.microsoft.com/office/word/2012/wordml" xmlns:w16cex="http://schemas.microsoft.com/office/word/2018/wordml/cex" xmlns:w16cid="http://schemas.microsoft.com/office/word/2016/wordml/cid" xmlns:w16="http://schemas.microsoft.com/office/word/2018/wordml" xmlns:w16sdtdh="http://schemas.microsoft.com/office/word/2020/wordml/sdtdatahash" xmlns:w16se="http://schemas.microsoft.com/office/word/2015/wordml/symex" xmlns:wpg="http://schemas.microsoft.com/office/word/2010/wordprocessingGroup" xmlns:wpi="http://schemas.microsoft.com/office/word/2010/wordprocessingInk" xmlns:wne="http://schemas.microsoft.com/office/word/2006/wordml" xmlns:wps="http://schemas.microsoft.com/office/word/2010/wordprocessingShape" mc:Ignorable="w14 w15 w16se w16cid w16 w16cex w16sdtdh wp14">
+<w:numbering xmlns:wpc="http://schemas.microsoft.com/office/word/2010/wordprocessingCanvas" xmlns:cx="http://schemas.microsoft.com/office/drawing/2014/chartex" xmlns:cx1="http://schemas.microsoft.com/office/drawing/2015/9/8/chartex" xmlns:cx2="http://schemas.microsoft.com/office/drawing/2015/10/21/chartex" xmlns:cx3="http://schemas.microsoft.com/office/drawing/2016/5/9/chartex" xmlns:cx4="http://schemas.microsoft.com/office/drawing/2016/5/10/chartex" xmlns:cx5="http://schemas.microsoft.com/office/drawing/2016/5/11/chartex" xmlns:cx6="http://schemas.microsoft.com/office/drawing/2016/5/12/chartex" xmlns:cx7="http://schemas.microsoft.com/office/drawing/2016/5/13/chartex" xmlns:cx8="http://schemas.microsoft.com/office/drawing/2016/5/14/chartex" xmlns:mc="http://schemas.openxmlformats.org/markup-compatibility/2006" xmlns:aink="http://schemas.microsoft.com/office/drawing/2016/ink" xmlns:am3d="http://schemas.microsoft.com/office/drawing/2017/model3d" xmlns:o="urn:schemas-microsoft-com:office:office" xmlns:oel="http://schemas.microsoft.com/office/2019/extlst" xmlns:r="http://schemas.openxmlformats.org/officeDocument/2006/relationships" xmlns:m="http://schemas.openxmlformats.org/officeDocument/2006/math" xmlns:v="urn:schemas-microsoft-com:vml" xmlns:wp14="http://schemas.microsoft.com/office/word/2010/wordprocessingDrawing" xmlns:wp="http://schemas.openxmlformats.org/drawingml/2006/wordprocessingDrawing" xmlns:w10="urn:schemas-microsoft-com:office:word" xmlns:w="http://schemas.openxmlformats.org/wordprocessingml/2006/main" xmlns:w14="http://schemas.microsoft.com/office/word/2010/wordml" xmlns:w15="http://schemas.microsoft.com/office/word/2012/wordml" xmlns:w16cex="http://schemas.microsoft.com/office/word/2018/wordml/cex" xmlns:w16cid="http://schemas.microsoft.com/office/word/2016/wordml/cid" xmlns:w16="http://schemas.microsoft.com/office/word/2018/wordml" xmlns:w16du="http://schemas.microsoft.com/office/word/2023/wordml/word16du" xmlns:w16sdtdh="http://schemas.microsoft.com/office/word/2020/wordml/sdtdatahash" xmlns:w16sdtfl="http://schemas.microsoft.com/office/word/2024/wordml/sdtformatlock" xmlns:w16se="http://schemas.microsoft.com/office/word/2015/wordml/symex" xmlns:wpg="http://schemas.microsoft.com/office/word/2010/wordprocessingGroup" xmlns:wpi="http://schemas.microsoft.com/office/word/2010/wordprocessingInk" xmlns:wne="http://schemas.microsoft.com/office/word/2006/wordml" xmlns:wps="http://schemas.microsoft.com/office/word/2010/wordprocessingShape" mc:Ignorable="w14 w15 w16se w16cid w16 w16cex w16sdtdh w16sdtfl w16du wp14">
   <w:abstractNum w:abstractNumId="0" w15:restartNumberingAfterBreak="0">
     <w:nsid w:val="0F42013D"/>
     <w:multiLevelType w:val="hybridMultilevel"/>
@@ -3599,26 +2028,26 @@
       </w:pPr>
     </w:lvl>
   </w:abstractNum>
-  <w:num w:numId="1">
+  <w:num w:numId="1" w16cid:durableId="1833057051">
     <w:abstractNumId w:val="1"/>
   </w:num>
-  <w:num w:numId="2">
+  <w:num w:numId="2" w16cid:durableId="2115511011">
     <w:abstractNumId w:val="3"/>
   </w:num>
-  <w:num w:numId="3">
+  <w:num w:numId="3" w16cid:durableId="647250625">
     <w:abstractNumId w:val="4"/>
   </w:num>
-  <w:num w:numId="4">
+  <w:num w:numId="4" w16cid:durableId="1565676516">
     <w:abstractNumId w:val="2"/>
   </w:num>
-  <w:num w:numId="5">
+  <w:num w:numId="5" w16cid:durableId="1588883215">
     <w:abstractNumId w:val="0"/>
   </w:num>
 </w:numbering>
 </file>
 
 <file path=word/styles.xml><?xml version="1.0" encoding="utf-8"?>
-<w:styles xmlns:mc="http://schemas.openxmlformats.org/markup-compatibility/2006" xmlns:r="http://schemas.openxmlformats.org/officeDocument/2006/relationships" xmlns:w="http://schemas.openxmlformats.org/wordprocessingml/2006/main" xmlns:w14="http://schemas.microsoft.com/office/word/2010/wordml" xmlns:w15="http://schemas.microsoft.com/office/word/2012/wordml" xmlns:w16cex="http://schemas.microsoft.com/office/word/2018/wordml/cex" xmlns:w16cid="http://schemas.microsoft.com/office/word/2016/wordml/cid" xmlns:w16="http://schemas.microsoft.com/office/word/2018/wordml" xmlns:w16sdtdh="http://schemas.microsoft.com/office/word/2020/wordml/sdtdatahash" xmlns:w16se="http://schemas.microsoft.com/office/word/2015/wordml/symex" mc:Ignorable="w14 w15 w16se w16cid w16 w16cex w16sdtdh">
+<w:styles xmlns:mc="http://schemas.openxmlformats.org/markup-compatibility/2006" xmlns:r="http://schemas.openxmlformats.org/officeDocument/2006/relationships" xmlns:w="http://schemas.openxmlformats.org/wordprocessingml/2006/main" xmlns:w14="http://schemas.microsoft.com/office/word/2010/wordml" xmlns:w15="http://schemas.microsoft.com/office/word/2012/wordml" xmlns:w16cex="http://schemas.microsoft.com/office/word/2018/wordml/cex" xmlns:w16cid="http://schemas.microsoft.com/office/word/2016/wordml/cid" xmlns:w16="http://schemas.microsoft.com/office/word/2018/wordml" xmlns:w16du="http://schemas.microsoft.com/office/word/2023/wordml/word16du" xmlns:w16sdtdh="http://schemas.microsoft.com/office/word/2020/wordml/sdtdatahash" xmlns:w16sdtfl="http://schemas.microsoft.com/office/word/2024/wordml/sdtformatlock" xmlns:w16se="http://schemas.microsoft.com/office/word/2015/wordml/symex" mc:Ignorable="w14 w15 w16se w16cid w16 w16cex w16sdtdh w16sdtfl w16du">
   <w:docDefaults>
     <w:rPrDefault>
       <w:rPr>
@@ -3646,6 +2075,7 @@
     <w:lsdException w:name="Strong" w:qFormat="1"/>
     <w:lsdException w:name="Emphasis" w:qFormat="1"/>
     <w:lsdException w:name="HTML Keyboard" w:semiHidden="1" w:unhideWhenUsed="1"/>
+    <w:lsdException w:name="Normal Table" w:semiHidden="1" w:unhideWhenUsed="1"/>
     <w:lsdException w:name="annotation subject" w:semiHidden="1" w:unhideWhenUsed="1"/>
     <w:lsdException w:name="No List" w:semiHidden="1" w:unhideWhenUsed="1"/>
     <w:lsdException w:name="Outline List 1" w:semiHidden="1" w:unhideWhenUsed="1"/>
@@ -3688,8 +2118,11 @@
     <w:lsdException w:name="Table Contemporary" w:semiHidden="1" w:unhideWhenUsed="1"/>
     <w:lsdException w:name="Table Elegant" w:semiHidden="1" w:unhideWhenUsed="1"/>
     <w:lsdException w:name="Table Professional" w:semiHidden="1" w:unhideWhenUsed="1"/>
+    <w:lsdException w:name="Table Subtle 1" w:semiHidden="1" w:unhideWhenUsed="1"/>
     <w:lsdException w:name="Table Subtle 2" w:semiHidden="1" w:unhideWhenUsed="1"/>
     <w:lsdException w:name="Table Web 1" w:semiHidden="1" w:unhideWhenUsed="1"/>
+    <w:lsdException w:name="Table Web 2" w:semiHidden="1" w:unhideWhenUsed="1"/>
+    <w:lsdException w:name="Table Web 3" w:semiHidden="1" w:unhideWhenUsed="1"/>
     <w:lsdException w:name="Balloon Text" w:semiHidden="1" w:unhideWhenUsed="1"/>
     <w:lsdException w:name="Table Theme" w:semiHidden="1" w:unhideWhenUsed="1"/>
     <w:lsdException w:name="Placeholder Text" w:semiHidden="1" w:uiPriority="99"/>

</xml_diff>